<commit_message>
update resume and make projects printable
</commit_message>
<xml_diff>
--- a/Resume and Result/Mohd Talib Raeen - Resume.docx
+++ b/Resume and Result/Mohd Talib Raeen - Resume.docx
@@ -7,23 +7,23 @@
         <w:spacing w:after="60" w:line="252" w:lineRule="auto"/>
         <w:jc w:val="center"/>
         <w:rPr>
-          <w:rFonts w:ascii="Garamond" w:hAnsi="Garamond" w:cs="Arial"/>
+          <w:rFonts w:ascii="Aptos" w:hAnsi="Aptos" w:cs="Arial"/>
           <w:b/>
           <w:bCs/>
           <w:w w:val="110"/>
-          <w:sz w:val="36"/>
-          <w:szCs w:val="36"/>
+          <w:sz w:val="40"/>
+          <w:szCs w:val="40"/>
           <w:lang w:val="en-IN"/>
         </w:rPr>
       </w:pPr>
       <w:r>
         <w:rPr>
-          <w:rFonts w:ascii="Garamond" w:hAnsi="Garamond" w:cs="Arial"/>
+          <w:rFonts w:ascii="Aptos" w:hAnsi="Aptos" w:cs="Arial"/>
           <w:b/>
           <w:bCs/>
           <w:w w:val="110"/>
-          <w:sz w:val="36"/>
-          <w:szCs w:val="36"/>
+          <w:sz w:val="40"/>
+          <w:szCs w:val="40"/>
           <w:lang w:val="en-IN"/>
         </w:rPr>
         <w:t>MOHD. TALIB RAEEN</w:t>
@@ -34,13 +34,13 @@
         <w:spacing w:before="240" w:after="60" w:line="252" w:lineRule="auto"/>
         <w:jc w:val="center"/>
         <w:rPr>
-          <w:rFonts w:ascii="Arial" w:hAnsi="Arial" w:cs="Arial"/>
+          <w:rFonts w:ascii="Aptos" w:hAnsi="Aptos" w:cs="Arial"/>
           <w:lang w:val="en-IN"/>
         </w:rPr>
       </w:pPr>
       <w:r>
         <w:rPr>
-          <w:rFonts w:ascii="Arial" w:hAnsi="Arial" w:cs="Arial"/>
+          <w:rFonts w:ascii="Aptos" w:hAnsi="Aptos" w:cs="Arial"/>
           <w:lang w:val="en-IN"/>
         </w:rPr>
         <w:t xml:space="preserve">Mumbai, India | +91 9987209844 | </w:t>
@@ -49,7 +49,7 @@
         <w:r>
           <w:rPr>
             <w:rStyle w:val="Hyperlink"/>
-            <w:rFonts w:ascii="Arial" w:hAnsi="Arial" w:cs="Arial"/>
+            <w:rFonts w:ascii="Aptos" w:hAnsi="Aptos" w:cs="Arial"/>
             <w:color w:val="auto"/>
             <w:u w:val="none"/>
             <w:lang w:val="en-IN"/>
@@ -59,7 +59,7 @@
       </w:hyperlink>
       <w:r>
         <w:rPr>
-          <w:rFonts w:ascii="Arial" w:hAnsi="Arial" w:cs="Arial"/>
+          <w:rFonts w:ascii="Aptos" w:hAnsi="Aptos" w:cs="Arial"/>
           <w:lang w:val="en-IN"/>
         </w:rPr>
         <w:t xml:space="preserve"> | </w:t>
@@ -68,7 +68,7 @@
         <w:r>
           <w:rPr>
             <w:rStyle w:val="Hyperlink"/>
-            <w:rFonts w:ascii="Arial" w:hAnsi="Arial" w:cs="Arial"/>
+            <w:rFonts w:ascii="Aptos" w:hAnsi="Aptos" w:cs="Arial"/>
             <w:color w:val="auto"/>
             <w:u w:val="none"/>
             <w:lang w:val="en-IN"/>
@@ -79,9 +79,57 @@
     </w:p>
     <w:p>
       <w:pPr>
-        <w:spacing w:after="60" w:line="252" w:lineRule="auto"/>
-        <w:rPr>
-          <w:rFonts w:ascii="Arial" w:hAnsi="Arial" w:cs="Arial"/>
+        <w:spacing w:before="360" w:after="60" w:line="252" w:lineRule="auto"/>
+        <w:rPr>
+          <w:rFonts w:ascii="Aptos" w:hAnsi="Aptos" w:cs="Arial"/>
+          <w:b/>
+          <w:bCs/>
+          <w:sz w:val="26"/>
+          <w:szCs w:val="26"/>
+          <w:lang w:val="en-IN"/>
+        </w:rPr>
+      </w:pPr>
+      <w:r>
+        <w:rPr>
+          <w:rFonts w:ascii="Aptos" w:hAnsi="Aptos" w:cs="Arial"/>
+          <w:b/>
+          <w:bCs/>
+          <w:sz w:val="26"/>
+          <w:szCs w:val="26"/>
+          <w:lang w:val="en-IN"/>
+        </w:rPr>
+        <w:t>SUMMARY</w:t>
+      </w:r>
+    </w:p>
+    <w:p>
+      <w:pPr>
+        <w:spacing w:before="120" w:after="60" w:line="252" w:lineRule="auto"/>
+        <w:rPr>
+          <w:rStyle w:val="Strong"/>
+          <w:rFonts w:ascii="Aptos" w:hAnsi="Aptos"/>
+          <w:b w:val="0"/>
+          <w:bCs w:val="0"/>
+          <w:sz w:val="22"/>
+          <w:szCs w:val="22"/>
+        </w:rPr>
+      </w:pPr>
+      <w:r>
+        <w:rPr>
+          <w:rStyle w:val="Strong"/>
+          <w:rFonts w:ascii="Aptos" w:hAnsi="Aptos"/>
+          <w:b w:val="0"/>
+          <w:bCs w:val="0"/>
+          <w:sz w:val="22"/>
+          <w:szCs w:val="22"/>
+        </w:rPr>
+        <w:t>BAF graduate with FMVA and BIDA certifications, skilled in financial modeling, valuation, MIS reporting, Excel, Power BI and SQL. Seeking MIS Executive, MIS Analyst or Financial Analyst roles.</w:t>
+      </w:r>
+    </w:p>
+    <w:p>
+      <w:pPr>
+        <w:spacing w:before="120" w:after="60" w:line="252" w:lineRule="auto"/>
+        <w:rPr>
+          <w:rFonts w:ascii="Aptos" w:hAnsi="Aptos" w:cs="Arial"/>
           <w:b/>
           <w:bCs/>
           <w:lang w:val="en-IN"/>
@@ -90,781 +138,707 @@
     </w:p>
     <w:p>
       <w:pPr>
-        <w:spacing w:before="360" w:after="60" w:line="252" w:lineRule="auto"/>
-        <w:rPr>
-          <w:rFonts w:ascii="Garamond" w:hAnsi="Garamond" w:cs="Arial"/>
+        <w:spacing w:after="60" w:line="252" w:lineRule="auto"/>
+        <w:rPr>
+          <w:rFonts w:ascii="Aptos" w:hAnsi="Aptos" w:cs="Arial"/>
+          <w:sz w:val="22"/>
+          <w:szCs w:val="22"/>
+        </w:rPr>
+      </w:pPr>
+      <w:r>
+        <w:rPr>
+          <w:rFonts w:ascii="Aptos" w:hAnsi="Aptos" w:cs="Arial"/>
+          <w:b/>
+          <w:bCs/>
+          <w:sz w:val="26"/>
+          <w:szCs w:val="26"/>
+          <w:lang w:val="en-IN"/>
+        </w:rPr>
+        <w:t>EDUCATION</w:t>
+      </w:r>
+      <w:r>
+        <w:rPr>
+          <w:rFonts w:ascii="Aptos" w:eastAsia="Times New Roman" w:hAnsi="Aptos" w:cs="Courier New"/>
+          <w:kern w:val="0"/>
+          <w:sz w:val="20"/>
+          <w:szCs w:val="20"/>
+          <w14:ligatures w14:val="none"/>
+        </w:rPr>
+        <w:br/>
+      </w:r>
+      <w:r>
+        <w:rPr>
+          <w:rFonts w:ascii="Aptos" w:hAnsi="Aptos" w:cs="Arial"/>
+          <w:sz w:val="22"/>
+          <w:szCs w:val="22"/>
+        </w:rPr>
+        <w:t xml:space="preserve">Bachelor of Accounting &amp; Finance (CGPI: 8.33)                   </w:t>
+      </w:r>
+      <w:r>
+        <w:rPr>
+          <w:rFonts w:ascii="Aptos" w:hAnsi="Aptos" w:cs="Arial"/>
+          <w:sz w:val="22"/>
+          <w:szCs w:val="22"/>
+        </w:rPr>
+        <w:tab/>
+      </w:r>
+      <w:r>
+        <w:rPr>
+          <w:rFonts w:ascii="Aptos" w:hAnsi="Aptos" w:cs="Arial"/>
+          <w:sz w:val="22"/>
+          <w:szCs w:val="22"/>
+        </w:rPr>
+        <w:tab/>
+      </w:r>
+      <w:r>
+        <w:rPr>
+          <w:rFonts w:ascii="Aptos" w:hAnsi="Aptos" w:cs="Arial"/>
+          <w:sz w:val="22"/>
+          <w:szCs w:val="22"/>
+        </w:rPr>
+        <w:tab/>
+      </w:r>
+      <w:r>
+        <w:rPr>
+          <w:rFonts w:ascii="Aptos" w:hAnsi="Aptos" w:cs="Arial"/>
+          <w:sz w:val="22"/>
+          <w:szCs w:val="22"/>
+        </w:rPr>
+        <w:tab/>
+      </w:r>
+      <w:r>
+        <w:rPr>
+          <w:rFonts w:ascii="Aptos" w:hAnsi="Aptos" w:cs="Arial"/>
+          <w:sz w:val="22"/>
+          <w:szCs w:val="22"/>
+        </w:rPr>
+        <w:tab/>
+      </w:r>
+      <w:r>
+        <w:rPr>
+          <w:rFonts w:ascii="Aptos" w:hAnsi="Aptos" w:cs="Arial"/>
+          <w:sz w:val="22"/>
+          <w:szCs w:val="22"/>
+        </w:rPr>
+        <w:t>2023–2026</w:t>
+      </w:r>
+    </w:p>
+    <w:p>
+      <w:pPr>
+        <w:spacing w:after="60" w:line="252" w:lineRule="auto"/>
+        <w:rPr>
+          <w:rFonts w:ascii="Aptos" w:hAnsi="Aptos" w:cs="Arial"/>
+          <w:sz w:val="22"/>
+          <w:szCs w:val="22"/>
+        </w:rPr>
+      </w:pPr>
+      <w:r>
+        <w:rPr>
+          <w:rFonts w:ascii="Aptos" w:hAnsi="Aptos" w:cs="Arial"/>
+          <w:sz w:val="22"/>
+          <w:szCs w:val="22"/>
+        </w:rPr>
+        <w:t>M.S. College of Arts, Science, Commerce &amp; BMS (Sem V–VI)</w:t>
+      </w:r>
+    </w:p>
+    <w:p>
+      <w:pPr>
+        <w:spacing w:after="60" w:line="252" w:lineRule="auto"/>
+        <w:rPr>
+          <w:rFonts w:ascii="Aptos" w:hAnsi="Aptos" w:cs="Arial"/>
+          <w:sz w:val="22"/>
+          <w:szCs w:val="22"/>
+        </w:rPr>
+      </w:pPr>
+      <w:r>
+        <w:rPr>
+          <w:rFonts w:ascii="Aptos" w:hAnsi="Aptos" w:cs="Arial"/>
+          <w:sz w:val="22"/>
+          <w:szCs w:val="22"/>
+        </w:rPr>
+        <w:t>Sree Narayana Guru College of Commerce (Sem I–IV)</w:t>
+      </w:r>
+    </w:p>
+    <w:p>
+      <w:pPr>
+        <w:spacing w:after="60" w:line="252" w:lineRule="auto"/>
+        <w:rPr>
+          <w:rFonts w:ascii="Aptos" w:hAnsi="Aptos" w:cs="Arial"/>
+          <w:sz w:val="22"/>
+          <w:szCs w:val="22"/>
+        </w:rPr>
+      </w:pPr>
+      <w:r>
+        <w:rPr>
+          <w:rFonts w:ascii="Aptos" w:hAnsi="Aptos" w:cs="Arial"/>
+          <w:sz w:val="22"/>
+          <w:szCs w:val="22"/>
+        </w:rPr>
+        <w:t xml:space="preserve">HSC — </w:t>
+      </w:r>
+      <w:r>
+        <w:rPr>
+          <w:rFonts w:ascii="Aptos" w:hAnsi="Aptos" w:cs="Arial"/>
+          <w:sz w:val="22"/>
+          <w:szCs w:val="22"/>
+        </w:rPr>
+        <w:t>Asadullah Khan English High School &amp; Jr College</w:t>
+      </w:r>
+      <w:r>
+        <w:rPr>
+          <w:rFonts w:ascii="Aptos" w:hAnsi="Aptos" w:cs="Arial"/>
+          <w:sz w:val="22"/>
+          <w:szCs w:val="22"/>
+        </w:rPr>
+        <w:t xml:space="preserve"> </w:t>
+      </w:r>
+      <w:r>
+        <w:rPr>
+          <w:rFonts w:ascii="Aptos" w:hAnsi="Aptos" w:cs="Arial"/>
+          <w:sz w:val="22"/>
+          <w:szCs w:val="22"/>
+        </w:rPr>
+        <w:t>| 80%</w:t>
+      </w:r>
+      <w:r>
+        <w:rPr>
+          <w:rFonts w:ascii="Aptos" w:hAnsi="Aptos" w:cs="Arial"/>
+          <w:sz w:val="22"/>
+          <w:szCs w:val="22"/>
+        </w:rPr>
+        <w:tab/>
+      </w:r>
+      <w:r>
+        <w:rPr>
+          <w:rFonts w:ascii="Aptos" w:hAnsi="Aptos" w:cs="Arial"/>
+          <w:sz w:val="22"/>
+          <w:szCs w:val="22"/>
+        </w:rPr>
+        <w:tab/>
+      </w:r>
+      <w:r>
+        <w:rPr>
+          <w:rFonts w:ascii="Aptos" w:hAnsi="Aptos" w:cs="Arial"/>
+          <w:sz w:val="22"/>
+          <w:szCs w:val="22"/>
+        </w:rPr>
+        <w:tab/>
+      </w:r>
+      <w:r>
+        <w:rPr>
+          <w:rFonts w:ascii="Aptos" w:hAnsi="Aptos" w:cs="Arial"/>
+          <w:sz w:val="22"/>
+          <w:szCs w:val="22"/>
+        </w:rPr>
+        <w:tab/>
+      </w:r>
+      <w:r>
+        <w:rPr>
+          <w:rFonts w:ascii="Aptos" w:hAnsi="Aptos" w:cs="Arial"/>
+          <w:sz w:val="22"/>
+          <w:szCs w:val="22"/>
+        </w:rPr>
+        <w:t>2023</w:t>
+      </w:r>
+    </w:p>
+    <w:p>
+      <w:pPr>
+        <w:spacing w:after="60" w:line="252" w:lineRule="auto"/>
+        <w:rPr>
+          <w:rFonts w:ascii="Aptos" w:hAnsi="Aptos" w:cs="Arial"/>
+          <w:sz w:val="22"/>
+          <w:szCs w:val="22"/>
+        </w:rPr>
+      </w:pPr>
+      <w:r>
+        <w:rPr>
+          <w:rFonts w:ascii="Aptos" w:hAnsi="Aptos" w:cs="Arial"/>
+          <w:sz w:val="22"/>
+          <w:szCs w:val="22"/>
+        </w:rPr>
+        <w:t xml:space="preserve">SSC — TMC Urdu Secondary School No. </w:t>
+      </w:r>
+      <w:r>
+        <w:rPr>
+          <w:rFonts w:ascii="Aptos" w:hAnsi="Aptos" w:cs="Arial"/>
+          <w:sz w:val="22"/>
+          <w:szCs w:val="22"/>
+        </w:rPr>
+        <w:t>31</w:t>
+      </w:r>
+      <w:r>
+        <w:rPr>
+          <w:rFonts w:ascii="Aptos" w:hAnsi="Aptos" w:cs="Arial"/>
+          <w:sz w:val="22"/>
+          <w:szCs w:val="22"/>
+        </w:rPr>
+        <w:t>, Thane | 7</w:t>
+      </w:r>
+      <w:r>
+        <w:rPr>
+          <w:rFonts w:ascii="Aptos" w:hAnsi="Aptos" w:cs="Arial"/>
+          <w:sz w:val="22"/>
+          <w:szCs w:val="22"/>
+        </w:rPr>
+        <w:t>2</w:t>
+      </w:r>
+      <w:r>
+        <w:rPr>
+          <w:rFonts w:ascii="Aptos" w:hAnsi="Aptos" w:cs="Arial"/>
+          <w:sz w:val="22"/>
+          <w:szCs w:val="22"/>
+        </w:rPr>
+        <w:t>%</w:t>
+      </w:r>
+      <w:r>
+        <w:rPr>
+          <w:rFonts w:ascii="Aptos" w:hAnsi="Aptos" w:cs="Arial"/>
+          <w:sz w:val="22"/>
+          <w:szCs w:val="22"/>
+        </w:rPr>
+        <w:tab/>
+      </w:r>
+      <w:r>
+        <w:rPr>
+          <w:rFonts w:ascii="Aptos" w:hAnsi="Aptos" w:cs="Arial"/>
+          <w:sz w:val="22"/>
+          <w:szCs w:val="22"/>
+        </w:rPr>
+        <w:tab/>
+      </w:r>
+      <w:r>
+        <w:rPr>
+          <w:rFonts w:ascii="Aptos" w:hAnsi="Aptos" w:cs="Arial"/>
+          <w:sz w:val="22"/>
+          <w:szCs w:val="22"/>
+        </w:rPr>
+        <w:tab/>
+      </w:r>
+      <w:r>
+        <w:rPr>
+          <w:rFonts w:ascii="Aptos" w:hAnsi="Aptos" w:cs="Arial"/>
+          <w:sz w:val="22"/>
+          <w:szCs w:val="22"/>
+        </w:rPr>
+        <w:tab/>
+      </w:r>
+      <w:r>
+        <w:rPr>
+          <w:rFonts w:ascii="Aptos" w:hAnsi="Aptos" w:cs="Arial"/>
+          <w:sz w:val="22"/>
+          <w:szCs w:val="22"/>
+        </w:rPr>
+        <w:tab/>
+      </w:r>
+      <w:r>
+        <w:rPr>
+          <w:rFonts w:ascii="Aptos" w:hAnsi="Aptos" w:cs="Arial"/>
+          <w:sz w:val="22"/>
+          <w:szCs w:val="22"/>
+        </w:rPr>
+        <w:t>2021</w:t>
+      </w:r>
+    </w:p>
+    <w:p>
+      <w:pPr>
+        <w:spacing w:after="60" w:line="252" w:lineRule="auto"/>
+        <w:rPr>
+          <w:rFonts w:ascii="Aptos" w:hAnsi="Aptos" w:cs="Arial"/>
           <w:b/>
           <w:bCs/>
           <w:lang w:val="en-IN"/>
         </w:rPr>
       </w:pPr>
-      <w:r>
-        <w:rPr>
-          <w:rFonts w:ascii="Garamond" w:hAnsi="Garamond" w:cs="Arial"/>
+    </w:p>
+    <w:p>
+      <w:pPr>
+        <w:spacing w:after="60" w:line="252" w:lineRule="auto"/>
+        <w:rPr>
+          <w:rFonts w:ascii="Aptos" w:hAnsi="Aptos" w:cs="Arial"/>
           <w:b/>
           <w:bCs/>
+          <w:sz w:val="26"/>
+          <w:szCs w:val="26"/>
           <w:lang w:val="en-IN"/>
         </w:rPr>
-        <w:t>SUMMARY</w:t>
-      </w:r>
-    </w:p>
-    <w:p>
-      <w:pPr>
-        <w:spacing w:before="120" w:after="60" w:line="252" w:lineRule="auto"/>
-        <w:rPr>
-          <w:rStyle w:val="Strong"/>
-          <w:b w:val="0"/>
-          <w:bCs w:val="0"/>
-        </w:rPr>
-      </w:pPr>
-      <w:r>
-        <w:rPr>
-          <w:rStyle w:val="Strong"/>
-          <w:b w:val="0"/>
-          <w:bCs w:val="0"/>
-        </w:rPr>
-        <w:t>BAF graduate with FMVA and BIDA certifications, skilled in financial modeling, valuation, MIS reporting, Excel, Power BI and SQL. Seeking MIS Executive, MIS Analyst or Financial Analyst roles.</w:t>
-      </w:r>
-    </w:p>
-    <w:p>
-      <w:pPr>
-        <w:spacing w:before="120" w:after="60" w:line="252" w:lineRule="auto"/>
-        <w:rPr>
-          <w:rFonts w:ascii="Arial" w:hAnsi="Arial" w:cs="Arial"/>
+      </w:pPr>
+      <w:r>
+        <w:rPr>
+          <w:rFonts w:ascii="Aptos" w:hAnsi="Aptos" w:cs="Arial"/>
           <w:b/>
           <w:bCs/>
+          <w:sz w:val="26"/>
+          <w:szCs w:val="26"/>
           <w:lang w:val="en-IN"/>
         </w:rPr>
-      </w:pPr>
+        <w:t>CERTIFICATIONS</w:t>
+      </w:r>
+    </w:p>
+    <w:p>
+      <w:pPr>
+        <w:spacing w:before="120" w:after="60" w:line="252" w:lineRule="auto"/>
+        <w:rPr>
+          <w:rFonts w:ascii="Aptos" w:hAnsi="Aptos" w:cs="Arial"/>
+          <w:sz w:val="22"/>
+          <w:szCs w:val="22"/>
+        </w:rPr>
+      </w:pPr>
+      <w:r>
+        <w:rPr>
+          <w:rFonts w:ascii="Aptos" w:hAnsi="Aptos" w:cs="Arial"/>
+          <w:sz w:val="22"/>
+          <w:szCs w:val="22"/>
+        </w:rPr>
+        <w:t>FMVA — Corporate Finance Institute</w:t>
+      </w:r>
+      <w:r>
+        <w:rPr>
+          <w:rFonts w:ascii="Aptos" w:hAnsi="Aptos" w:cs="Arial"/>
+          <w:sz w:val="22"/>
+          <w:szCs w:val="22"/>
+        </w:rPr>
+        <w:tab/>
+      </w:r>
+      <w:r>
+        <w:rPr>
+          <w:rFonts w:ascii="Aptos" w:hAnsi="Aptos" w:cs="Arial"/>
+          <w:sz w:val="22"/>
+          <w:szCs w:val="22"/>
+        </w:rPr>
+        <w:tab/>
+      </w:r>
+      <w:r>
+        <w:rPr>
+          <w:rFonts w:ascii="Aptos" w:hAnsi="Aptos" w:cs="Arial"/>
+          <w:sz w:val="22"/>
+          <w:szCs w:val="22"/>
+        </w:rPr>
+        <w:tab/>
+      </w:r>
+      <w:r>
+        <w:rPr>
+          <w:rFonts w:ascii="Aptos" w:hAnsi="Aptos" w:cs="Arial"/>
+          <w:sz w:val="22"/>
+          <w:szCs w:val="22"/>
+        </w:rPr>
+        <w:tab/>
+      </w:r>
+      <w:r>
+        <w:rPr>
+          <w:rFonts w:ascii="Aptos" w:hAnsi="Aptos" w:cs="Arial"/>
+          <w:sz w:val="22"/>
+          <w:szCs w:val="22"/>
+        </w:rPr>
+        <w:tab/>
+      </w:r>
+      <w:r>
+        <w:rPr>
+          <w:rFonts w:ascii="Aptos" w:hAnsi="Aptos" w:cs="Arial"/>
+          <w:sz w:val="22"/>
+          <w:szCs w:val="22"/>
+        </w:rPr>
+        <w:tab/>
+      </w:r>
+      <w:r>
+        <w:rPr>
+          <w:rFonts w:ascii="Aptos" w:hAnsi="Aptos" w:cs="Arial"/>
+          <w:sz w:val="22"/>
+          <w:szCs w:val="22"/>
+        </w:rPr>
+        <w:tab/>
+      </w:r>
+      <w:r>
+        <w:rPr>
+          <w:rFonts w:ascii="Aptos" w:hAnsi="Aptos" w:cs="Arial"/>
+          <w:sz w:val="22"/>
+          <w:szCs w:val="22"/>
+        </w:rPr>
+        <w:tab/>
+      </w:r>
+      <w:r>
+        <w:rPr>
+          <w:rFonts w:ascii="Aptos" w:hAnsi="Aptos" w:cs="Arial"/>
+          <w:sz w:val="22"/>
+          <w:szCs w:val="22"/>
+        </w:rPr>
+        <w:t>2026</w:t>
+      </w:r>
+    </w:p>
+    <w:p>
+      <w:pPr>
+        <w:spacing w:before="120" w:after="60" w:line="252" w:lineRule="auto"/>
+        <w:rPr>
+          <w:rFonts w:ascii="Aptos" w:hAnsi="Aptos" w:cs="Arial"/>
+          <w:sz w:val="22"/>
+          <w:szCs w:val="22"/>
+        </w:rPr>
+      </w:pPr>
+      <w:r>
+        <w:rPr>
+          <w:rFonts w:ascii="Aptos" w:hAnsi="Aptos" w:cs="Arial"/>
+          <w:sz w:val="22"/>
+          <w:szCs w:val="22"/>
+        </w:rPr>
+        <w:t>BIDA — Corporate Finance Institute</w:t>
+      </w:r>
+      <w:r>
+        <w:rPr>
+          <w:rFonts w:ascii="Aptos" w:hAnsi="Aptos" w:cs="Arial"/>
+          <w:sz w:val="22"/>
+          <w:szCs w:val="22"/>
+        </w:rPr>
+        <w:tab/>
+      </w:r>
+      <w:r>
+        <w:rPr>
+          <w:rFonts w:ascii="Aptos" w:hAnsi="Aptos" w:cs="Arial"/>
+          <w:sz w:val="22"/>
+          <w:szCs w:val="22"/>
+        </w:rPr>
+        <w:tab/>
+      </w:r>
+      <w:r>
+        <w:rPr>
+          <w:rFonts w:ascii="Aptos" w:hAnsi="Aptos" w:cs="Arial"/>
+          <w:sz w:val="22"/>
+          <w:szCs w:val="22"/>
+        </w:rPr>
+        <w:tab/>
+      </w:r>
+      <w:r>
+        <w:rPr>
+          <w:rFonts w:ascii="Aptos" w:hAnsi="Aptos" w:cs="Arial"/>
+          <w:sz w:val="22"/>
+          <w:szCs w:val="22"/>
+        </w:rPr>
+        <w:tab/>
+      </w:r>
+      <w:r>
+        <w:rPr>
+          <w:rFonts w:ascii="Aptos" w:hAnsi="Aptos" w:cs="Arial"/>
+          <w:sz w:val="22"/>
+          <w:szCs w:val="22"/>
+        </w:rPr>
+        <w:tab/>
+      </w:r>
+      <w:r>
+        <w:rPr>
+          <w:rFonts w:ascii="Aptos" w:hAnsi="Aptos" w:cs="Arial"/>
+          <w:sz w:val="22"/>
+          <w:szCs w:val="22"/>
+        </w:rPr>
+        <w:tab/>
+      </w:r>
+      <w:r>
+        <w:rPr>
+          <w:rFonts w:ascii="Aptos" w:hAnsi="Aptos" w:cs="Arial"/>
+          <w:sz w:val="22"/>
+          <w:szCs w:val="22"/>
+        </w:rPr>
+        <w:tab/>
+      </w:r>
+      <w:r>
+        <w:rPr>
+          <w:rFonts w:ascii="Aptos" w:hAnsi="Aptos" w:cs="Arial"/>
+          <w:sz w:val="22"/>
+          <w:szCs w:val="22"/>
+        </w:rPr>
+        <w:tab/>
+      </w:r>
+      <w:r>
+        <w:rPr>
+          <w:rFonts w:ascii="Aptos" w:hAnsi="Aptos" w:cs="Arial"/>
+          <w:sz w:val="22"/>
+          <w:szCs w:val="22"/>
+        </w:rPr>
+        <w:t>2026</w:t>
+      </w:r>
+    </w:p>
+    <w:p>
+      <w:pPr>
+        <w:spacing w:before="120" w:after="60" w:line="252" w:lineRule="auto"/>
+        <w:rPr>
+          <w:rFonts w:ascii="Aptos" w:hAnsi="Aptos" w:cs="Arial"/>
+          <w:sz w:val="22"/>
+          <w:szCs w:val="22"/>
+        </w:rPr>
+      </w:pPr>
+      <w:r>
+        <w:rPr>
+          <w:rFonts w:ascii="Aptos" w:hAnsi="Aptos" w:cs="Arial"/>
+          <w:sz w:val="22"/>
+          <w:szCs w:val="22"/>
+        </w:rPr>
+        <w:t>NISM Series XV — Research Analyst</w:t>
+      </w:r>
+      <w:r>
+        <w:rPr>
+          <w:rFonts w:ascii="Aptos" w:hAnsi="Aptos" w:cs="Arial"/>
+          <w:sz w:val="22"/>
+          <w:szCs w:val="22"/>
+        </w:rPr>
+        <w:tab/>
+      </w:r>
+      <w:r>
+        <w:rPr>
+          <w:rFonts w:ascii="Aptos" w:hAnsi="Aptos" w:cs="Arial"/>
+          <w:sz w:val="22"/>
+          <w:szCs w:val="22"/>
+        </w:rPr>
+        <w:tab/>
+      </w:r>
+      <w:r>
+        <w:rPr>
+          <w:rFonts w:ascii="Aptos" w:hAnsi="Aptos" w:cs="Arial"/>
+          <w:sz w:val="22"/>
+          <w:szCs w:val="22"/>
+        </w:rPr>
+        <w:tab/>
+      </w:r>
+      <w:r>
+        <w:rPr>
+          <w:rFonts w:ascii="Aptos" w:hAnsi="Aptos" w:cs="Arial"/>
+          <w:sz w:val="22"/>
+          <w:szCs w:val="22"/>
+        </w:rPr>
+        <w:tab/>
+      </w:r>
+      <w:r>
+        <w:rPr>
+          <w:rFonts w:ascii="Aptos" w:hAnsi="Aptos" w:cs="Arial"/>
+          <w:sz w:val="22"/>
+          <w:szCs w:val="22"/>
+        </w:rPr>
+        <w:tab/>
+      </w:r>
+      <w:r>
+        <w:rPr>
+          <w:rFonts w:ascii="Aptos" w:hAnsi="Aptos" w:cs="Arial"/>
+          <w:sz w:val="22"/>
+          <w:szCs w:val="22"/>
+        </w:rPr>
+        <w:tab/>
+      </w:r>
+      <w:r>
+        <w:rPr>
+          <w:rFonts w:ascii="Aptos" w:hAnsi="Aptos" w:cs="Arial"/>
+          <w:sz w:val="22"/>
+          <w:szCs w:val="22"/>
+        </w:rPr>
+        <w:tab/>
+      </w:r>
+      <w:r>
+        <w:rPr>
+          <w:rFonts w:ascii="Aptos" w:hAnsi="Aptos" w:cs="Arial"/>
+          <w:sz w:val="22"/>
+          <w:szCs w:val="22"/>
+        </w:rPr>
+        <w:tab/>
+      </w:r>
+      <w:r>
+        <w:rPr>
+          <w:rFonts w:ascii="Aptos" w:hAnsi="Aptos" w:cs="Arial"/>
+          <w:sz w:val="22"/>
+          <w:szCs w:val="22"/>
+        </w:rPr>
+        <w:t>2025</w:t>
+      </w:r>
+    </w:p>
+    <w:p>
+      <w:pPr>
+        <w:spacing w:before="120" w:after="60" w:line="252" w:lineRule="auto"/>
+        <w:rPr>
+          <w:rFonts w:ascii="Aptos" w:hAnsi="Aptos" w:cs="Arial"/>
+          <w:sz w:val="22"/>
+          <w:szCs w:val="22"/>
+        </w:rPr>
+      </w:pPr>
+      <w:r>
+        <w:rPr>
+          <w:rFonts w:ascii="Aptos" w:hAnsi="Aptos" w:cs="Arial"/>
+          <w:sz w:val="22"/>
+          <w:szCs w:val="22"/>
+        </w:rPr>
+        <w:t>NISM Series VIII — Equity Derivatives</w:t>
+      </w:r>
+      <w:r>
+        <w:rPr>
+          <w:rFonts w:ascii="Aptos" w:hAnsi="Aptos" w:cs="Arial"/>
+          <w:sz w:val="22"/>
+          <w:szCs w:val="22"/>
+        </w:rPr>
+        <w:tab/>
+      </w:r>
+      <w:r>
+        <w:rPr>
+          <w:rFonts w:ascii="Aptos" w:hAnsi="Aptos" w:cs="Arial"/>
+          <w:sz w:val="22"/>
+          <w:szCs w:val="22"/>
+        </w:rPr>
+        <w:tab/>
+      </w:r>
+      <w:r>
+        <w:rPr>
+          <w:rFonts w:ascii="Aptos" w:hAnsi="Aptos" w:cs="Arial"/>
+          <w:sz w:val="22"/>
+          <w:szCs w:val="22"/>
+        </w:rPr>
+        <w:tab/>
+      </w:r>
+      <w:r>
+        <w:rPr>
+          <w:rFonts w:ascii="Aptos" w:hAnsi="Aptos" w:cs="Arial"/>
+          <w:sz w:val="22"/>
+          <w:szCs w:val="22"/>
+        </w:rPr>
+        <w:tab/>
+      </w:r>
+      <w:r>
+        <w:rPr>
+          <w:rFonts w:ascii="Aptos" w:hAnsi="Aptos" w:cs="Arial"/>
+          <w:sz w:val="22"/>
+          <w:szCs w:val="22"/>
+        </w:rPr>
+        <w:tab/>
+      </w:r>
+      <w:r>
+        <w:rPr>
+          <w:rFonts w:ascii="Aptos" w:hAnsi="Aptos" w:cs="Arial"/>
+          <w:sz w:val="22"/>
+          <w:szCs w:val="22"/>
+        </w:rPr>
+        <w:tab/>
+      </w:r>
+      <w:r>
+        <w:rPr>
+          <w:rFonts w:ascii="Aptos" w:hAnsi="Aptos" w:cs="Arial"/>
+          <w:sz w:val="22"/>
+          <w:szCs w:val="22"/>
+        </w:rPr>
+        <w:tab/>
+      </w:r>
+      <w:r>
+        <w:rPr>
+          <w:rFonts w:ascii="Aptos" w:hAnsi="Aptos" w:cs="Arial"/>
+          <w:sz w:val="22"/>
+          <w:szCs w:val="22"/>
+        </w:rPr>
+        <w:tab/>
+      </w:r>
+      <w:r>
+        <w:rPr>
+          <w:rFonts w:ascii="Aptos" w:hAnsi="Aptos" w:cs="Arial"/>
+          <w:sz w:val="22"/>
+          <w:szCs w:val="22"/>
+        </w:rPr>
+        <w:t>2025</w:t>
+      </w:r>
     </w:p>
     <w:p>
       <w:pPr>
         <w:spacing w:after="60" w:line="252" w:lineRule="auto"/>
         <w:rPr>
-          <w:rFonts w:ascii="Garamond" w:hAnsi="Garamond" w:cs="Arial"/>
-          <w:b/>
-          <w:bCs/>
-          <w:lang w:val="en-IN"/>
-        </w:rPr>
-      </w:pPr>
-      <w:r>
-        <w:rPr>
-          <w:rFonts w:ascii="Garamond" w:hAnsi="Garamond" w:cs="Arial"/>
-          <w:b/>
-          <w:bCs/>
-          <w:lang w:val="en-IN"/>
-        </w:rPr>
-        <w:t>EDUCATION</w:t>
-      </w:r>
-    </w:p>
-    <w:p>
-      <w:pPr>
-        <w:spacing w:before="120" w:after="60" w:line="252" w:lineRule="auto"/>
-        <w:ind w:left="142"/>
-        <w:rPr>
-          <w:rFonts w:ascii="Arial" w:hAnsi="Arial" w:cs="Arial"/>
-          <w:sz w:val="22"/>
-          <w:szCs w:val="22"/>
-        </w:rPr>
-      </w:pPr>
-      <w:r>
-        <w:rPr>
-          <w:rFonts w:ascii="Arial" w:hAnsi="Arial" w:cs="Arial"/>
-          <w:sz w:val="22"/>
-          <w:szCs w:val="22"/>
-        </w:rPr>
-        <w:t>BAF</w:t>
-      </w:r>
-      <w:r>
-        <w:rPr>
-          <w:rFonts w:ascii="Arial" w:hAnsi="Arial" w:cs="Arial"/>
-          <w:sz w:val="22"/>
-          <w:szCs w:val="22"/>
-        </w:rPr>
-        <w:t xml:space="preserve"> — M.S. College of Arts, Science, Commerce &amp; BMS</w:t>
-      </w:r>
-      <w:r>
-        <w:rPr>
-          <w:rFonts w:ascii="Arial" w:hAnsi="Arial" w:cs="Arial"/>
-          <w:sz w:val="22"/>
-          <w:szCs w:val="22"/>
-        </w:rPr>
-        <w:t xml:space="preserve"> </w:t>
-      </w:r>
-      <w:r>
-        <w:rPr>
-          <w:rFonts w:ascii="Arial" w:hAnsi="Arial" w:cs="Arial"/>
-          <w:sz w:val="22"/>
-          <w:szCs w:val="22"/>
-        </w:rPr>
-        <w:t>| CGPA</w:t>
-      </w:r>
-      <w:r>
-        <w:rPr>
-          <w:rFonts w:ascii="Arial" w:hAnsi="Arial" w:cs="Arial"/>
-          <w:sz w:val="22"/>
-          <w:szCs w:val="22"/>
-        </w:rPr>
-        <w:t>:</w:t>
-      </w:r>
-      <w:r>
-        <w:rPr>
-          <w:rFonts w:ascii="Arial" w:hAnsi="Arial" w:cs="Arial"/>
-          <w:sz w:val="22"/>
-          <w:szCs w:val="22"/>
-        </w:rPr>
-        <w:t xml:space="preserve"> </w:t>
-      </w:r>
-      <w:r>
-        <w:rPr>
-          <w:rFonts w:ascii="Arial" w:hAnsi="Arial" w:cs="Arial"/>
-          <w:sz w:val="22"/>
-          <w:szCs w:val="22"/>
-        </w:rPr>
-        <w:t>8</w:t>
-      </w:r>
-      <w:r>
-        <w:rPr>
-          <w:rFonts w:ascii="Arial" w:hAnsi="Arial" w:cs="Arial"/>
-          <w:sz w:val="22"/>
-          <w:szCs w:val="22"/>
-        </w:rPr>
-        <w:t>.</w:t>
-      </w:r>
-      <w:r>
-        <w:rPr>
-          <w:rFonts w:ascii="Arial" w:hAnsi="Arial" w:cs="Arial"/>
-          <w:sz w:val="22"/>
-          <w:szCs w:val="22"/>
-        </w:rPr>
-        <w:t>6</w:t>
-      </w:r>
-      <w:r>
-        <w:rPr>
-          <w:rFonts w:ascii="Arial" w:hAnsi="Arial" w:cs="Arial"/>
-          <w:sz w:val="22"/>
-          <w:szCs w:val="22"/>
-        </w:rPr>
-        <w:tab/>
-      </w:r>
-      <w:r>
-        <w:rPr>
-          <w:rFonts w:ascii="Arial" w:hAnsi="Arial" w:cs="Arial"/>
-          <w:sz w:val="22"/>
-          <w:szCs w:val="22"/>
-        </w:rPr>
-        <w:tab/>
-      </w:r>
-      <w:r>
-        <w:rPr>
-          <w:rFonts w:ascii="Arial" w:hAnsi="Arial" w:cs="Arial"/>
-          <w:sz w:val="22"/>
-          <w:szCs w:val="22"/>
-        </w:rPr>
-        <w:t>2025–2026</w:t>
-      </w:r>
-    </w:p>
-    <w:p>
-      <w:pPr>
-        <w:spacing w:before="120" w:after="60" w:line="252" w:lineRule="auto"/>
-        <w:ind w:left="142"/>
-        <w:rPr>
-          <w:rFonts w:ascii="Arial" w:hAnsi="Arial" w:cs="Arial"/>
-          <w:sz w:val="22"/>
-          <w:szCs w:val="22"/>
-        </w:rPr>
-      </w:pPr>
-      <w:r>
-        <w:rPr>
-          <w:rFonts w:ascii="Arial" w:hAnsi="Arial" w:cs="Arial"/>
-          <w:sz w:val="22"/>
-          <w:szCs w:val="22"/>
-        </w:rPr>
-        <w:t>BAF</w:t>
-      </w:r>
-      <w:r>
-        <w:rPr>
-          <w:rFonts w:ascii="Arial" w:hAnsi="Arial" w:cs="Arial"/>
-          <w:sz w:val="22"/>
-          <w:szCs w:val="22"/>
-        </w:rPr>
-        <w:t xml:space="preserve"> — Sree Narayana Guru College of Commerce |</w:t>
-      </w:r>
-      <w:r>
-        <w:rPr>
-          <w:rFonts w:ascii="Arial" w:hAnsi="Arial" w:cs="Arial"/>
-          <w:sz w:val="22"/>
-          <w:szCs w:val="22"/>
-        </w:rPr>
-        <w:t xml:space="preserve"> </w:t>
-      </w:r>
-      <w:r>
-        <w:rPr>
-          <w:rFonts w:ascii="Arial" w:hAnsi="Arial" w:cs="Arial"/>
-          <w:sz w:val="22"/>
-          <w:szCs w:val="22"/>
-        </w:rPr>
-        <w:t>CGPA</w:t>
-      </w:r>
-      <w:r>
-        <w:rPr>
-          <w:rFonts w:ascii="Arial" w:hAnsi="Arial" w:cs="Arial"/>
-          <w:sz w:val="22"/>
-          <w:szCs w:val="22"/>
-        </w:rPr>
-        <w:t>:</w:t>
-      </w:r>
-      <w:r>
-        <w:rPr>
-          <w:rFonts w:ascii="Arial" w:hAnsi="Arial" w:cs="Arial"/>
-          <w:sz w:val="22"/>
-          <w:szCs w:val="22"/>
-        </w:rPr>
-        <w:t xml:space="preserve"> </w:t>
-      </w:r>
-      <w:r>
-        <w:rPr>
-          <w:rFonts w:ascii="Arial" w:hAnsi="Arial" w:cs="Arial"/>
-          <w:sz w:val="22"/>
-          <w:szCs w:val="22"/>
-        </w:rPr>
-        <w:t>8.4</w:t>
-      </w:r>
-      <w:r>
-        <w:rPr>
-          <w:rFonts w:ascii="Arial" w:hAnsi="Arial" w:cs="Arial"/>
-          <w:sz w:val="22"/>
-          <w:szCs w:val="22"/>
-        </w:rPr>
-        <w:tab/>
-      </w:r>
-      <w:r>
-        <w:rPr>
-          <w:rFonts w:ascii="Arial" w:hAnsi="Arial" w:cs="Arial"/>
-          <w:sz w:val="22"/>
-          <w:szCs w:val="22"/>
-        </w:rPr>
-        <w:tab/>
-      </w:r>
-      <w:r>
-        <w:rPr>
-          <w:rFonts w:ascii="Arial" w:hAnsi="Arial" w:cs="Arial"/>
-          <w:sz w:val="22"/>
-          <w:szCs w:val="22"/>
-        </w:rPr>
-        <w:tab/>
-      </w:r>
-      <w:r>
-        <w:rPr>
-          <w:rFonts w:ascii="Arial" w:hAnsi="Arial" w:cs="Arial"/>
-          <w:sz w:val="22"/>
-          <w:szCs w:val="22"/>
-        </w:rPr>
-        <w:t>2023–2025</w:t>
-      </w:r>
-    </w:p>
-    <w:p>
-      <w:pPr>
-        <w:spacing w:before="120" w:after="60" w:line="252" w:lineRule="auto"/>
-        <w:ind w:left="142"/>
-        <w:rPr>
-          <w:rFonts w:ascii="Arial" w:hAnsi="Arial" w:cs="Arial"/>
-          <w:sz w:val="22"/>
-          <w:szCs w:val="22"/>
-        </w:rPr>
-      </w:pPr>
-      <w:r>
-        <w:rPr>
-          <w:rFonts w:ascii="Arial" w:hAnsi="Arial" w:cs="Arial"/>
-          <w:sz w:val="22"/>
-          <w:szCs w:val="22"/>
-        </w:rPr>
-        <w:t>HSC</w:t>
-      </w:r>
-      <w:r>
-        <w:rPr>
-          <w:rFonts w:ascii="Arial" w:hAnsi="Arial" w:cs="Arial"/>
-          <w:sz w:val="22"/>
-          <w:szCs w:val="22"/>
-        </w:rPr>
-        <w:t xml:space="preserve"> — </w:t>
-      </w:r>
-      <w:r>
-        <w:rPr>
-          <w:rFonts w:ascii="Arial" w:hAnsi="Arial" w:cs="Arial"/>
-          <w:sz w:val="22"/>
-          <w:szCs w:val="22"/>
-        </w:rPr>
-        <w:t>Asadullah Khan English High School &amp; Jr College</w:t>
-      </w:r>
-      <w:r>
-        <w:rPr>
-          <w:rFonts w:ascii="Arial" w:hAnsi="Arial" w:cs="Arial"/>
-          <w:sz w:val="22"/>
-          <w:szCs w:val="22"/>
-        </w:rPr>
-        <w:t>| 80%</w:t>
-      </w:r>
-      <w:r>
-        <w:rPr>
-          <w:rFonts w:ascii="Arial" w:hAnsi="Arial" w:cs="Arial"/>
-          <w:sz w:val="22"/>
-          <w:szCs w:val="22"/>
-        </w:rPr>
-        <w:tab/>
-      </w:r>
-      <w:r>
-        <w:rPr>
-          <w:rFonts w:ascii="Arial" w:hAnsi="Arial" w:cs="Arial"/>
-          <w:sz w:val="22"/>
-          <w:szCs w:val="22"/>
-        </w:rPr>
-        <w:tab/>
-      </w:r>
-      <w:r>
-        <w:rPr>
-          <w:rFonts w:ascii="Arial" w:hAnsi="Arial" w:cs="Arial"/>
-          <w:sz w:val="22"/>
-          <w:szCs w:val="22"/>
-        </w:rPr>
-        <w:tab/>
-      </w:r>
-      <w:r>
-        <w:rPr>
-          <w:rFonts w:ascii="Arial" w:hAnsi="Arial" w:cs="Arial"/>
-          <w:sz w:val="22"/>
-          <w:szCs w:val="22"/>
-        </w:rPr>
-        <w:t>2023</w:t>
-      </w:r>
-    </w:p>
-    <w:p>
-      <w:pPr>
-        <w:spacing w:before="120" w:after="60" w:line="252" w:lineRule="auto"/>
-        <w:ind w:left="142"/>
-        <w:rPr>
-          <w:rFonts w:ascii="Arial" w:hAnsi="Arial" w:cs="Arial"/>
-          <w:sz w:val="22"/>
-          <w:szCs w:val="22"/>
-        </w:rPr>
-      </w:pPr>
-      <w:r>
-        <w:rPr>
-          <w:rFonts w:ascii="Arial" w:hAnsi="Arial" w:cs="Arial"/>
-          <w:sz w:val="22"/>
-          <w:szCs w:val="22"/>
-        </w:rPr>
-        <w:t>SSC</w:t>
-      </w:r>
-      <w:r>
-        <w:rPr>
-          <w:rFonts w:ascii="Arial" w:hAnsi="Arial" w:cs="Arial"/>
-          <w:sz w:val="22"/>
-          <w:szCs w:val="22"/>
-        </w:rPr>
-        <w:t xml:space="preserve"> — TMC Urdu Secondary School No. </w:t>
-      </w:r>
-      <w:r>
-        <w:rPr>
-          <w:rFonts w:ascii="Arial" w:hAnsi="Arial" w:cs="Arial"/>
-          <w:sz w:val="22"/>
-          <w:szCs w:val="22"/>
-        </w:rPr>
-        <w:t>31</w:t>
-      </w:r>
-      <w:r>
-        <w:rPr>
-          <w:rFonts w:ascii="Arial" w:hAnsi="Arial" w:cs="Arial"/>
-          <w:sz w:val="22"/>
-          <w:szCs w:val="22"/>
-        </w:rPr>
-        <w:t>, Thane | 7</w:t>
-      </w:r>
-      <w:r>
-        <w:rPr>
-          <w:rFonts w:ascii="Arial" w:hAnsi="Arial" w:cs="Arial"/>
-          <w:sz w:val="22"/>
-          <w:szCs w:val="22"/>
-        </w:rPr>
-        <w:t>2</w:t>
-      </w:r>
-      <w:r>
-        <w:rPr>
-          <w:rFonts w:ascii="Arial" w:hAnsi="Arial" w:cs="Arial"/>
-          <w:sz w:val="22"/>
-          <w:szCs w:val="22"/>
-        </w:rPr>
-        <w:t>%</w:t>
-      </w:r>
-      <w:r>
-        <w:rPr>
-          <w:rFonts w:ascii="Arial" w:hAnsi="Arial" w:cs="Arial"/>
-          <w:sz w:val="22"/>
-          <w:szCs w:val="22"/>
-        </w:rPr>
-        <w:tab/>
-      </w:r>
-      <w:r>
-        <w:rPr>
-          <w:rFonts w:ascii="Arial" w:hAnsi="Arial" w:cs="Arial"/>
-          <w:sz w:val="22"/>
-          <w:szCs w:val="22"/>
-        </w:rPr>
-        <w:tab/>
-      </w:r>
-      <w:r>
-        <w:rPr>
-          <w:rFonts w:ascii="Arial" w:hAnsi="Arial" w:cs="Arial"/>
-          <w:sz w:val="22"/>
-          <w:szCs w:val="22"/>
-        </w:rPr>
-        <w:tab/>
-      </w:r>
-      <w:r>
-        <w:rPr>
-          <w:rFonts w:ascii="Arial" w:hAnsi="Arial" w:cs="Arial"/>
-          <w:sz w:val="22"/>
-          <w:szCs w:val="22"/>
-        </w:rPr>
-        <w:t>2021</w:t>
-      </w:r>
-    </w:p>
-    <w:p>
-      <w:pPr>
-        <w:spacing w:after="60" w:line="252" w:lineRule="auto"/>
-        <w:rPr>
-          <w:rFonts w:ascii="Arial" w:hAnsi="Arial" w:cs="Arial"/>
-          <w:b/>
-          <w:bCs/>
-          <w:lang w:val="en-IN"/>
-        </w:rPr>
-      </w:pPr>
-    </w:p>
-    <w:p>
-      <w:pPr>
-        <w:spacing w:after="60" w:line="252" w:lineRule="auto"/>
-        <w:rPr>
-          <w:rFonts w:ascii="Garamond" w:hAnsi="Garamond" w:cs="Arial"/>
-          <w:b/>
-          <w:bCs/>
-          <w:lang w:val="en-IN"/>
-        </w:rPr>
-      </w:pPr>
-      <w:r>
-        <w:rPr>
-          <w:rFonts w:ascii="Garamond" w:hAnsi="Garamond" w:cs="Arial"/>
-          <w:b/>
-          <w:bCs/>
-          <w:lang w:val="en-IN"/>
-        </w:rPr>
-        <w:t>CERTIFICATIONS</w:t>
-      </w:r>
-    </w:p>
-    <w:p>
-      <w:pPr>
-        <w:spacing w:before="120" w:after="60" w:line="252" w:lineRule="auto"/>
-        <w:ind w:left="142"/>
-        <w:rPr>
-          <w:rFonts w:ascii="Arial" w:hAnsi="Arial" w:cs="Arial"/>
-          <w:sz w:val="22"/>
-          <w:szCs w:val="22"/>
-        </w:rPr>
-      </w:pPr>
-      <w:r>
-        <w:rPr>
-          <w:rFonts w:ascii="Arial" w:hAnsi="Arial" w:cs="Arial"/>
-          <w:sz w:val="22"/>
-          <w:szCs w:val="22"/>
-        </w:rPr>
-        <w:t>FMVA — Corporate Finance Institute</w:t>
-      </w:r>
-      <w:r>
-        <w:rPr>
-          <w:rFonts w:ascii="Arial" w:hAnsi="Arial" w:cs="Arial"/>
-          <w:sz w:val="22"/>
-          <w:szCs w:val="22"/>
-        </w:rPr>
-        <w:tab/>
-      </w:r>
-      <w:r>
-        <w:rPr>
-          <w:rFonts w:ascii="Arial" w:hAnsi="Arial" w:cs="Arial"/>
-          <w:sz w:val="22"/>
-          <w:szCs w:val="22"/>
-        </w:rPr>
-        <w:tab/>
-      </w:r>
-      <w:r>
-        <w:rPr>
-          <w:rFonts w:ascii="Arial" w:hAnsi="Arial" w:cs="Arial"/>
-          <w:sz w:val="22"/>
-          <w:szCs w:val="22"/>
-        </w:rPr>
-        <w:tab/>
-      </w:r>
-      <w:r>
-        <w:rPr>
-          <w:rFonts w:ascii="Arial" w:hAnsi="Arial" w:cs="Arial"/>
-          <w:sz w:val="22"/>
-          <w:szCs w:val="22"/>
-        </w:rPr>
-        <w:tab/>
-      </w:r>
-      <w:r>
-        <w:rPr>
-          <w:rFonts w:ascii="Arial" w:hAnsi="Arial" w:cs="Arial"/>
-          <w:sz w:val="22"/>
-          <w:szCs w:val="22"/>
-        </w:rPr>
-        <w:tab/>
-      </w:r>
-      <w:r>
-        <w:rPr>
-          <w:rFonts w:ascii="Arial" w:hAnsi="Arial" w:cs="Arial"/>
-          <w:sz w:val="22"/>
-          <w:szCs w:val="22"/>
-        </w:rPr>
-        <w:tab/>
-      </w:r>
-      <w:r>
-        <w:rPr>
-          <w:rFonts w:ascii="Arial" w:hAnsi="Arial" w:cs="Arial"/>
-          <w:sz w:val="22"/>
-          <w:szCs w:val="22"/>
-        </w:rPr>
-        <w:t>2026</w:t>
-      </w:r>
-    </w:p>
-    <w:p>
-      <w:pPr>
-        <w:spacing w:before="120" w:after="60" w:line="252" w:lineRule="auto"/>
-        <w:ind w:left="142"/>
-        <w:rPr>
-          <w:rFonts w:ascii="Arial" w:hAnsi="Arial" w:cs="Arial"/>
-          <w:sz w:val="22"/>
-          <w:szCs w:val="22"/>
-        </w:rPr>
-      </w:pPr>
-      <w:r>
-        <w:rPr>
-          <w:rFonts w:ascii="Arial" w:hAnsi="Arial" w:cs="Arial"/>
-          <w:sz w:val="22"/>
-          <w:szCs w:val="22"/>
-        </w:rPr>
-        <w:t>BIDA — Corporate Finance Institute</w:t>
-      </w:r>
-      <w:r>
-        <w:rPr>
-          <w:rFonts w:ascii="Arial" w:hAnsi="Arial" w:cs="Arial"/>
-          <w:sz w:val="22"/>
-          <w:szCs w:val="22"/>
-        </w:rPr>
-        <w:tab/>
-      </w:r>
-      <w:r>
-        <w:rPr>
-          <w:rFonts w:ascii="Arial" w:hAnsi="Arial" w:cs="Arial"/>
-          <w:sz w:val="22"/>
-          <w:szCs w:val="22"/>
-        </w:rPr>
-        <w:tab/>
-      </w:r>
-      <w:r>
-        <w:rPr>
-          <w:rFonts w:ascii="Arial" w:hAnsi="Arial" w:cs="Arial"/>
-          <w:sz w:val="22"/>
-          <w:szCs w:val="22"/>
-        </w:rPr>
-        <w:tab/>
-      </w:r>
-      <w:r>
-        <w:rPr>
-          <w:rFonts w:ascii="Arial" w:hAnsi="Arial" w:cs="Arial"/>
-          <w:sz w:val="22"/>
-          <w:szCs w:val="22"/>
-        </w:rPr>
-        <w:tab/>
-      </w:r>
-      <w:r>
-        <w:rPr>
-          <w:rFonts w:ascii="Arial" w:hAnsi="Arial" w:cs="Arial"/>
-          <w:sz w:val="22"/>
-          <w:szCs w:val="22"/>
-        </w:rPr>
-        <w:tab/>
-      </w:r>
-      <w:r>
-        <w:rPr>
-          <w:rFonts w:ascii="Arial" w:hAnsi="Arial" w:cs="Arial"/>
-          <w:sz w:val="22"/>
-          <w:szCs w:val="22"/>
-        </w:rPr>
-        <w:tab/>
-      </w:r>
-      <w:r>
-        <w:rPr>
-          <w:rFonts w:ascii="Arial" w:hAnsi="Arial" w:cs="Arial"/>
-          <w:sz w:val="22"/>
-          <w:szCs w:val="22"/>
-        </w:rPr>
-        <w:t>2026</w:t>
-      </w:r>
-    </w:p>
-    <w:p>
-      <w:pPr>
-        <w:spacing w:before="120" w:after="60" w:line="252" w:lineRule="auto"/>
-        <w:ind w:left="142"/>
-        <w:rPr>
-          <w:rFonts w:ascii="Arial" w:hAnsi="Arial" w:cs="Arial"/>
-          <w:sz w:val="22"/>
-          <w:szCs w:val="22"/>
-        </w:rPr>
-      </w:pPr>
-      <w:r>
-        <w:rPr>
-          <w:rFonts w:ascii="Arial" w:hAnsi="Arial" w:cs="Arial"/>
-          <w:sz w:val="22"/>
-          <w:szCs w:val="22"/>
-        </w:rPr>
-        <w:t>NISM Series XV — Research Analyst</w:t>
-      </w:r>
-      <w:r>
-        <w:rPr>
-          <w:rFonts w:ascii="Arial" w:hAnsi="Arial" w:cs="Arial"/>
-          <w:sz w:val="22"/>
-          <w:szCs w:val="22"/>
-        </w:rPr>
-        <w:tab/>
-      </w:r>
-      <w:r>
-        <w:rPr>
-          <w:rFonts w:ascii="Arial" w:hAnsi="Arial" w:cs="Arial"/>
-          <w:sz w:val="22"/>
-          <w:szCs w:val="22"/>
-        </w:rPr>
-        <w:tab/>
-      </w:r>
-      <w:r>
-        <w:rPr>
-          <w:rFonts w:ascii="Arial" w:hAnsi="Arial" w:cs="Arial"/>
-          <w:sz w:val="22"/>
-          <w:szCs w:val="22"/>
-        </w:rPr>
-        <w:tab/>
-      </w:r>
-      <w:r>
-        <w:rPr>
-          <w:rFonts w:ascii="Arial" w:hAnsi="Arial" w:cs="Arial"/>
-          <w:sz w:val="22"/>
-          <w:szCs w:val="22"/>
-        </w:rPr>
-        <w:tab/>
-      </w:r>
-      <w:r>
-        <w:rPr>
-          <w:rFonts w:ascii="Arial" w:hAnsi="Arial" w:cs="Arial"/>
-          <w:sz w:val="22"/>
-          <w:szCs w:val="22"/>
-        </w:rPr>
-        <w:tab/>
-      </w:r>
-      <w:r>
-        <w:rPr>
-          <w:rFonts w:ascii="Arial" w:hAnsi="Arial" w:cs="Arial"/>
-          <w:sz w:val="22"/>
-          <w:szCs w:val="22"/>
-        </w:rPr>
-        <w:tab/>
-      </w:r>
-      <w:r>
-        <w:rPr>
-          <w:rFonts w:ascii="Arial" w:hAnsi="Arial" w:cs="Arial"/>
-          <w:sz w:val="22"/>
-          <w:szCs w:val="22"/>
-        </w:rPr>
-        <w:t>2025</w:t>
-      </w:r>
-    </w:p>
-    <w:p>
-      <w:pPr>
-        <w:spacing w:before="120" w:after="60" w:line="252" w:lineRule="auto"/>
-        <w:ind w:left="142"/>
-        <w:rPr>
-          <w:rFonts w:ascii="Arial" w:hAnsi="Arial" w:cs="Arial"/>
-          <w:sz w:val="22"/>
-          <w:szCs w:val="22"/>
-        </w:rPr>
-      </w:pPr>
-      <w:r>
-        <w:rPr>
-          <w:rFonts w:ascii="Arial" w:hAnsi="Arial" w:cs="Arial"/>
-          <w:sz w:val="22"/>
-          <w:szCs w:val="22"/>
-        </w:rPr>
-        <w:t>NISM Series VIII — Equity Derivatives</w:t>
-      </w:r>
-      <w:r>
-        <w:rPr>
-          <w:rFonts w:ascii="Arial" w:hAnsi="Arial" w:cs="Arial"/>
-          <w:sz w:val="22"/>
-          <w:szCs w:val="22"/>
-        </w:rPr>
-        <w:tab/>
-      </w:r>
-      <w:r>
-        <w:rPr>
-          <w:rFonts w:ascii="Arial" w:hAnsi="Arial" w:cs="Arial"/>
-          <w:sz w:val="22"/>
-          <w:szCs w:val="22"/>
-        </w:rPr>
-        <w:tab/>
-      </w:r>
-      <w:r>
-        <w:rPr>
-          <w:rFonts w:ascii="Arial" w:hAnsi="Arial" w:cs="Arial"/>
-          <w:sz w:val="22"/>
-          <w:szCs w:val="22"/>
-        </w:rPr>
-        <w:tab/>
-      </w:r>
-      <w:r>
-        <w:rPr>
-          <w:rFonts w:ascii="Arial" w:hAnsi="Arial" w:cs="Arial"/>
-          <w:sz w:val="22"/>
-          <w:szCs w:val="22"/>
-        </w:rPr>
-        <w:tab/>
-      </w:r>
-      <w:r>
-        <w:rPr>
-          <w:rFonts w:ascii="Arial" w:hAnsi="Arial" w:cs="Arial"/>
-          <w:sz w:val="22"/>
-          <w:szCs w:val="22"/>
-        </w:rPr>
-        <w:tab/>
-      </w:r>
-      <w:r>
-        <w:rPr>
-          <w:rFonts w:ascii="Arial" w:hAnsi="Arial" w:cs="Arial"/>
-          <w:sz w:val="22"/>
-          <w:szCs w:val="22"/>
-        </w:rPr>
-        <w:tab/>
-      </w:r>
-      <w:r>
-        <w:rPr>
-          <w:rFonts w:ascii="Arial" w:hAnsi="Arial" w:cs="Arial"/>
-          <w:sz w:val="22"/>
-          <w:szCs w:val="22"/>
-        </w:rPr>
-        <w:t>2025</w:t>
-      </w:r>
-    </w:p>
-    <w:p>
-      <w:pPr>
-        <w:spacing w:after="60" w:line="252" w:lineRule="auto"/>
-        <w:rPr>
-          <w:rFonts w:ascii="Arial" w:hAnsi="Arial" w:cs="Arial"/>
+          <w:rFonts w:ascii="Aptos" w:hAnsi="Aptos" w:cs="Arial"/>
           <w:sz w:val="20"/>
           <w:szCs w:val="20"/>
           <w:lang w:val="en-IN"/>
@@ -875,17 +849,21 @@
       <w:pPr>
         <w:spacing w:after="60" w:line="252" w:lineRule="auto"/>
         <w:rPr>
-          <w:rFonts w:ascii="Garamond" w:hAnsi="Garamond" w:cs="Arial"/>
+          <w:rFonts w:ascii="Aptos" w:hAnsi="Aptos" w:cs="Arial"/>
           <w:b/>
           <w:bCs/>
+          <w:sz w:val="26"/>
+          <w:szCs w:val="26"/>
           <w:lang w:val="en-IN"/>
         </w:rPr>
       </w:pPr>
       <w:r>
         <w:rPr>
-          <w:rFonts w:ascii="Garamond" w:hAnsi="Garamond" w:cs="Arial"/>
+          <w:rFonts w:ascii="Aptos" w:hAnsi="Aptos" w:cs="Arial"/>
           <w:b/>
           <w:bCs/>
+          <w:sz w:val="26"/>
+          <w:szCs w:val="26"/>
           <w:lang w:val="en-IN"/>
         </w:rPr>
         <w:t>SKILLS</w:t>
@@ -894,16 +872,15 @@
     <w:p>
       <w:pPr>
         <w:spacing w:before="120" w:after="60" w:line="252" w:lineRule="auto"/>
-        <w:ind w:left="142"/>
-        <w:rPr>
-          <w:rFonts w:ascii="Arial" w:hAnsi="Arial" w:cs="Arial"/>
-          <w:sz w:val="22"/>
-          <w:szCs w:val="22"/>
-        </w:rPr>
-      </w:pPr>
-      <w:r>
-        <w:rPr>
-          <w:rFonts w:ascii="Arial" w:hAnsi="Arial" w:cs="Arial"/>
+        <w:rPr>
+          <w:rFonts w:ascii="Aptos" w:hAnsi="Aptos" w:cs="Arial"/>
+          <w:sz w:val="22"/>
+          <w:szCs w:val="22"/>
+        </w:rPr>
+      </w:pPr>
+      <w:r>
+        <w:rPr>
+          <w:rFonts w:ascii="Aptos" w:hAnsi="Aptos" w:cs="Arial"/>
           <w:b/>
           <w:bCs/>
           <w:sz w:val="22"/>
@@ -913,59 +890,33 @@
       </w:r>
       <w:r>
         <w:rPr>
-          <w:rFonts w:ascii="Arial" w:hAnsi="Arial" w:cs="Arial"/>
+          <w:rFonts w:ascii="Aptos" w:hAnsi="Aptos" w:cs="Arial"/>
           <w:sz w:val="22"/>
           <w:szCs w:val="22"/>
         </w:rPr>
         <w:t xml:space="preserve"> </w:t>
       </w:r>
       <w:r>
-        <w:t>Financial Modeling</w:t>
-      </w:r>
-      <w:r>
-        <w:t xml:space="preserve">, </w:t>
-      </w:r>
-      <w:r>
-        <w:t>3-Statement Modeling</w:t>
-      </w:r>
-      <w:r>
-        <w:t xml:space="preserve">, </w:t>
-      </w:r>
-      <w:r>
-        <w:t>DCF Valuation</w:t>
-      </w:r>
-      <w:r>
-        <w:t xml:space="preserve">, </w:t>
-      </w:r>
-      <w:r>
-        <w:t>Comparable Company Analysis</w:t>
-      </w:r>
-      <w:r>
-        <w:t xml:space="preserve">, </w:t>
-      </w:r>
-      <w:r>
-        <w:t>Financial Statement Analysis</w:t>
-      </w:r>
-      <w:r>
-        <w:t xml:space="preserve">, </w:t>
-      </w:r>
-      <w:r>
-        <w:t>Budgeting &amp; Forecasting</w:t>
+        <w:rPr>
+          <w:rFonts w:ascii="Aptos" w:hAnsi="Aptos"/>
+          <w:sz w:val="22"/>
+          <w:szCs w:val="22"/>
+        </w:rPr>
+        <w:t>Financial Modeling, 3-Statement Modeling, DCF Valuation, Comparable Company Analysis, Financial Statement Analysis, Budgeting &amp; Forecasting</w:t>
       </w:r>
     </w:p>
     <w:p>
       <w:pPr>
         <w:spacing w:before="120" w:after="60" w:line="252" w:lineRule="auto"/>
-        <w:ind w:left="142"/>
-        <w:rPr>
-          <w:rFonts w:ascii="Arial" w:hAnsi="Arial" w:cs="Arial"/>
-          <w:sz w:val="22"/>
-          <w:szCs w:val="22"/>
-        </w:rPr>
-      </w:pPr>
-      <w:r>
-        <w:rPr>
-          <w:rFonts w:ascii="Arial" w:hAnsi="Arial" w:cs="Arial"/>
+        <w:rPr>
+          <w:rFonts w:ascii="Aptos" w:hAnsi="Aptos" w:cs="Arial"/>
+          <w:sz w:val="22"/>
+          <w:szCs w:val="22"/>
+        </w:rPr>
+      </w:pPr>
+      <w:r>
+        <w:rPr>
+          <w:rFonts w:ascii="Aptos" w:hAnsi="Aptos" w:cs="Arial"/>
           <w:b/>
           <w:bCs/>
           <w:sz w:val="22"/>
@@ -974,29 +925,19 @@
         <w:t>Analytics:</w:t>
       </w:r>
       <w:r>
-        <w:t xml:space="preserve"> </w:t>
-      </w:r>
-      <w:r>
-        <w:t>Excel (XLOOKUP, INDEX-MATCH, Pivot Tables, Power Query)</w:t>
-      </w:r>
-      <w:r>
-        <w:t xml:space="preserve">, </w:t>
-      </w:r>
-      <w:r>
-        <w:t>Power BI</w:t>
-      </w:r>
-      <w:r>
-        <w:t xml:space="preserve">, </w:t>
-      </w:r>
-      <w:r>
-        <w:t>SQL (Basic)</w:t>
+        <w:rPr>
+          <w:rFonts w:ascii="Aptos" w:hAnsi="Aptos"/>
+          <w:sz w:val="22"/>
+          <w:szCs w:val="22"/>
+        </w:rPr>
+        <w:t xml:space="preserve"> Excel (XLOOKUP, INDEX-MATCH, Pivot Tables, Power Query), Power BI, SQL</w:t>
       </w:r>
     </w:p>
     <w:p>
       <w:pPr>
         <w:spacing w:after="60" w:line="252" w:lineRule="auto"/>
         <w:rPr>
-          <w:rFonts w:ascii="Arial" w:hAnsi="Arial" w:cs="Arial"/>
+          <w:rFonts w:ascii="Aptos" w:hAnsi="Aptos" w:cs="Arial"/>
           <w:sz w:val="22"/>
           <w:szCs w:val="22"/>
           <w:lang w:val="en-IN"/>
@@ -1007,17 +948,21 @@
       <w:pPr>
         <w:spacing w:after="60" w:line="252" w:lineRule="auto"/>
         <w:rPr>
-          <w:rFonts w:ascii="Garamond" w:hAnsi="Garamond" w:cs="Arial"/>
+          <w:rFonts w:ascii="Aptos" w:hAnsi="Aptos" w:cs="Arial"/>
           <w:b/>
           <w:bCs/>
+          <w:sz w:val="26"/>
+          <w:szCs w:val="26"/>
           <w:lang w:val="en-IN"/>
         </w:rPr>
       </w:pPr>
       <w:r>
         <w:rPr>
-          <w:rFonts w:ascii="Garamond" w:hAnsi="Garamond" w:cs="Arial"/>
+          <w:rFonts w:ascii="Aptos" w:hAnsi="Aptos" w:cs="Arial"/>
           <w:b/>
           <w:bCs/>
+          <w:sz w:val="26"/>
+          <w:szCs w:val="26"/>
           <w:lang w:val="en-IN"/>
         </w:rPr>
         <w:t>PROJECTS</w:t>
@@ -1026,52 +971,32 @@
     <w:p>
       <w:pPr>
         <w:spacing w:before="120" w:after="60" w:line="252" w:lineRule="auto"/>
-        <w:ind w:left="142"/>
-        <w:rPr>
-          <w:rFonts w:ascii="Arial" w:hAnsi="Arial" w:cs="Arial"/>
+        <w:rPr>
+          <w:rFonts w:ascii="Aptos" w:hAnsi="Aptos" w:cs="Arial"/>
           <w:b/>
           <w:bCs/>
-          <w:sz w:val="22"/>
-          <w:szCs w:val="22"/>
-        </w:rPr>
-      </w:pPr>
-      <w:r>
-        <w:rPr>
-          <w:rFonts w:ascii="Arial" w:hAnsi="Arial" w:cs="Arial"/>
+        </w:rPr>
+      </w:pPr>
+      <w:r>
+        <w:rPr>
+          <w:rStyle w:val="Strong"/>
+          <w:rFonts w:ascii="Aptos" w:hAnsi="Aptos"/>
+        </w:rPr>
+        <w:t>3-Statement Financial Model &amp; DCF Valuation</w:t>
+      </w:r>
+      <w:r>
+        <w:rPr>
+          <w:rFonts w:ascii="Aptos" w:hAnsi="Aptos" w:cs="Arial"/>
           <w:b/>
           <w:bCs/>
-          <w:sz w:val="22"/>
-          <w:szCs w:val="22"/>
-        </w:rPr>
-        <w:t>3-</w:t>
-      </w:r>
-      <w:r>
-        <w:rPr>
-          <w:rFonts w:ascii="Arial" w:hAnsi="Arial" w:cs="Arial"/>
+        </w:rPr>
+        <w:t xml:space="preserve">— </w:t>
+      </w:r>
+      <w:r>
+        <w:rPr>
+          <w:rFonts w:ascii="Aptos" w:hAnsi="Aptos" w:cs="Arial"/>
           <w:b/>
           <w:bCs/>
-          <w:sz w:val="20"/>
-          <w:szCs w:val="20"/>
-        </w:rPr>
-        <w:t>Statement</w:t>
-      </w:r>
-      <w:r>
-        <w:rPr>
-          <w:rFonts w:ascii="Arial" w:hAnsi="Arial" w:cs="Arial"/>
-          <w:b/>
-          <w:bCs/>
-          <w:sz w:val="22"/>
-          <w:szCs w:val="22"/>
-        </w:rPr>
-        <w:t xml:space="preserve"> Financial Model + DCF — </w:t>
-      </w:r>
-      <w:r>
-        <w:rPr>
-          <w:rFonts w:ascii="Arial" w:hAnsi="Arial" w:cs="Arial"/>
-          <w:b/>
-          <w:bCs/>
-          <w:sz w:val="22"/>
-          <w:szCs w:val="22"/>
         </w:rPr>
         <w:t>Hindustan Unilever</w:t>
       </w:r>
@@ -1079,17 +1004,17 @@
     <w:p>
       <w:pPr>
         <w:spacing w:before="120" w:after="60" w:line="252" w:lineRule="auto"/>
-        <w:ind w:left="142"/>
         <w:rPr>
           <w:rStyle w:val="Hyperlink"/>
-          <w:rFonts w:ascii="Arial" w:hAnsi="Arial" w:cs="Arial"/>
-          <w:sz w:val="22"/>
-          <w:szCs w:val="22"/>
-        </w:rPr>
-      </w:pPr>
-      <w:r>
-        <w:rPr>
-          <w:rFonts w:ascii="Arial" w:hAnsi="Arial" w:cs="Arial"/>
+          <w:rFonts w:ascii="Aptos" w:hAnsi="Aptos" w:cs="Arial"/>
+          <w:color w:val="auto"/>
+          <w:sz w:val="22"/>
+          <w:szCs w:val="22"/>
+        </w:rPr>
+      </w:pPr>
+      <w:r>
+        <w:rPr>
+          <w:rFonts w:ascii="Aptos" w:hAnsi="Aptos" w:cs="Arial"/>
           <w:sz w:val="22"/>
           <w:szCs w:val="22"/>
         </w:rPr>
@@ -1097,7 +1022,7 @@
       </w:r>
       <w:r>
         <w:rPr>
-          <w:rFonts w:ascii="Arial" w:hAnsi="Arial" w:cs="Arial"/>
+          <w:rFonts w:ascii="Aptos" w:hAnsi="Aptos" w:cs="Arial"/>
           <w:sz w:val="22"/>
           <w:szCs w:val="22"/>
           <w:u w:val="single"/>
@@ -1106,16 +1031,16 @@
       </w:r>
       <w:r>
         <w:rPr>
-          <w:rFonts w:ascii="Arial" w:hAnsi="Arial" w:cs="Arial"/>
+          <w:rFonts w:ascii="Aptos" w:hAnsi="Aptos" w:cs="Arial"/>
           <w:sz w:val="22"/>
           <w:szCs w:val="22"/>
           <w:u w:val="single"/>
         </w:rPr>
-        <w:instrText>HYPERLINK "drive.google.com/file/d/hul-financial-model-dcf"</w:instrText>
-      </w:r>
-      <w:r>
-        <w:rPr>
-          <w:rFonts w:ascii="Arial" w:hAnsi="Arial" w:cs="Arial"/>
+        <w:instrText>HYPERLINK "https://github.com/talibbb13/Finance-Portfolio/tree/main/Projects/HUL%20DCF%20Valuation"</w:instrText>
+      </w:r>
+      <w:r>
+        <w:rPr>
+          <w:rFonts w:ascii="Aptos" w:hAnsi="Aptos" w:cs="Arial"/>
           <w:sz w:val="22"/>
           <w:szCs w:val="22"/>
           <w:u w:val="single"/>
@@ -1123,7 +1048,7 @@
       </w:r>
       <w:r>
         <w:rPr>
-          <w:rFonts w:ascii="Arial" w:hAnsi="Arial" w:cs="Arial"/>
+          <w:rFonts w:ascii="Aptos" w:hAnsi="Aptos" w:cs="Arial"/>
           <w:sz w:val="22"/>
           <w:szCs w:val="22"/>
           <w:u w:val="single"/>
@@ -1132,30 +1057,11 @@
       </w:r>
       <w:r>
         <w:rPr>
-          <w:rStyle w:val="Hyperlink"/>
-          <w:rFonts w:ascii="Arial" w:hAnsi="Arial" w:cs="Arial"/>
-          <w:sz w:val="22"/>
-          <w:szCs w:val="22"/>
-        </w:rPr>
-        <w:t>github.com/talibb</w:t>
-      </w:r>
-      <w:r>
-        <w:rPr>
-          <w:rStyle w:val="Hyperlink"/>
-          <w:rFonts w:ascii="Arial" w:hAnsi="Arial" w:cs="Arial"/>
-          <w:sz w:val="22"/>
-          <w:szCs w:val="22"/>
-        </w:rPr>
-        <w:t>b</w:t>
-      </w:r>
-      <w:r>
-        <w:rPr>
-          <w:rStyle w:val="Hyperlink"/>
-          <w:rFonts w:ascii="Arial" w:hAnsi="Arial" w:cs="Arial"/>
-          <w:sz w:val="22"/>
-          <w:szCs w:val="22"/>
-        </w:rPr>
-        <w:t>13/Finance-Portfolio/tree/main/Projects/HUL DCF Valuation</w:t>
+          <w:rFonts w:ascii="Aptos" w:hAnsi="Aptos" w:cs="Arial"/>
+          <w:sz w:val="22"/>
+          <w:szCs w:val="22"/>
+        </w:rPr>
+        <w:t>github.com/talibbb13/Finance-Portfolio</w:t>
       </w:r>
     </w:p>
     <w:p>
@@ -1168,14 +1074,14 @@
         <w:spacing w:after="60" w:line="252" w:lineRule="auto"/>
         <w:ind w:left="530"/>
         <w:rPr>
-          <w:rFonts w:ascii="Arial" w:hAnsi="Arial" w:cs="Arial"/>
-          <w:sz w:val="22"/>
-          <w:szCs w:val="22"/>
-        </w:rPr>
-      </w:pPr>
-      <w:r>
-        <w:rPr>
-          <w:rFonts w:ascii="Arial" w:hAnsi="Arial" w:cs="Arial"/>
+          <w:rFonts w:ascii="Aptos" w:hAnsi="Aptos" w:cs="Arial"/>
+          <w:sz w:val="22"/>
+          <w:szCs w:val="22"/>
+        </w:rPr>
+      </w:pPr>
+      <w:r>
+        <w:rPr>
+          <w:rFonts w:ascii="Aptos" w:hAnsi="Aptos" w:cs="Arial"/>
           <w:sz w:val="22"/>
           <w:szCs w:val="22"/>
           <w:u w:val="single"/>
@@ -1184,11 +1090,11 @@
       </w:r>
       <w:r>
         <w:rPr>
-          <w:rFonts w:ascii="Arial" w:hAnsi="Arial" w:cs="Arial"/>
-          <w:sz w:val="22"/>
-          <w:szCs w:val="22"/>
-        </w:rPr>
-        <w:t>Built integrated income statement, balance sheet and cash-flow model with supporting schedules.</w:t>
+          <w:rFonts w:ascii="Aptos" w:hAnsi="Aptos"/>
+          <w:sz w:val="22"/>
+          <w:szCs w:val="22"/>
+        </w:rPr>
+        <w:t>Built a fully integrated 3-statement financial model with supporting schedules.</w:t>
       </w:r>
     </w:p>
     <w:p>
@@ -1201,18 +1107,18 @@
         <w:spacing w:after="60" w:line="252" w:lineRule="auto"/>
         <w:ind w:left="530"/>
         <w:rPr>
-          <w:rFonts w:ascii="Arial" w:hAnsi="Arial" w:cs="Arial"/>
-          <w:sz w:val="22"/>
-          <w:szCs w:val="22"/>
-        </w:rPr>
-      </w:pPr>
-      <w:r>
-        <w:rPr>
-          <w:rFonts w:ascii="Arial" w:hAnsi="Arial" w:cs="Arial"/>
-          <w:sz w:val="22"/>
-          <w:szCs w:val="22"/>
-        </w:rPr>
-        <w:t>Developed DCF valuation using WACC, terminal growth and exit multiple sensitivity.</w:t>
+          <w:rFonts w:ascii="Aptos" w:hAnsi="Aptos" w:cs="Arial"/>
+          <w:sz w:val="22"/>
+          <w:szCs w:val="22"/>
+        </w:rPr>
+      </w:pPr>
+      <w:r>
+        <w:rPr>
+          <w:rFonts w:ascii="Aptos" w:hAnsi="Aptos"/>
+          <w:sz w:val="22"/>
+          <w:szCs w:val="22"/>
+        </w:rPr>
+        <w:t>Performed DCF valuation using WACC, perpetual growth and exit multiple methodologies.</w:t>
       </w:r>
     </w:p>
     <w:p>
@@ -1225,84 +1131,90 @@
         <w:spacing w:after="60" w:line="252" w:lineRule="auto"/>
         <w:ind w:left="530"/>
         <w:rPr>
-          <w:rFonts w:ascii="Arial" w:hAnsi="Arial" w:cs="Arial"/>
-          <w:sz w:val="22"/>
-          <w:szCs w:val="22"/>
-        </w:rPr>
-      </w:pPr>
-      <w:r>
-        <w:rPr>
-          <w:rFonts w:ascii="Arial" w:hAnsi="Arial" w:cs="Arial"/>
-          <w:sz w:val="22"/>
-          <w:szCs w:val="22"/>
-        </w:rPr>
-        <w:t>Modeled revolver logic and scenario analysis (base/bull/bear).</w:t>
+          <w:rFonts w:ascii="Aptos" w:hAnsi="Aptos" w:cs="Arial"/>
+          <w:sz w:val="22"/>
+          <w:szCs w:val="22"/>
+        </w:rPr>
+      </w:pPr>
+      <w:r>
+        <w:rPr>
+          <w:rFonts w:ascii="Aptos" w:hAnsi="Aptos"/>
+          <w:sz w:val="22"/>
+          <w:szCs w:val="22"/>
+        </w:rPr>
+        <w:t>Designed sensitivity and scenario analysis (Bull/Base/Bear)</w:t>
+      </w:r>
+      <w:r>
+        <w:rPr>
+          <w:rFonts w:ascii="Aptos" w:hAnsi="Aptos"/>
+          <w:sz w:val="22"/>
+          <w:szCs w:val="22"/>
+        </w:rPr>
+        <w:t>.</w:t>
       </w:r>
     </w:p>
     <w:p>
       <w:pPr>
         <w:spacing w:before="120" w:after="60" w:line="252" w:lineRule="auto"/>
-        <w:ind w:left="142"/>
-        <w:rPr>
-          <w:rFonts w:ascii="Arial" w:hAnsi="Arial" w:cs="Arial"/>
+        <w:rPr>
+          <w:rFonts w:ascii="Aptos" w:hAnsi="Aptos" w:cs="Arial"/>
           <w:b/>
           <w:bCs/>
-          <w:sz w:val="22"/>
-          <w:szCs w:val="22"/>
-        </w:rPr>
-      </w:pPr>
-      <w:r>
-        <w:rPr>
-          <w:rFonts w:ascii="Arial" w:hAnsi="Arial" w:cs="Arial"/>
+        </w:rPr>
+      </w:pPr>
+      <w:r>
+        <w:rPr>
+          <w:rFonts w:ascii="Aptos" w:hAnsi="Aptos" w:cs="Arial"/>
           <w:b/>
           <w:bCs/>
-          <w:sz w:val="20"/>
-          <w:szCs w:val="20"/>
-        </w:rPr>
-        <w:t>Comparable</w:t>
-      </w:r>
-      <w:r>
-        <w:rPr>
-          <w:rFonts w:ascii="Arial" w:hAnsi="Arial" w:cs="Arial"/>
-          <w:b/>
-          <w:bCs/>
-          <w:sz w:val="22"/>
-          <w:szCs w:val="22"/>
-        </w:rPr>
-        <w:t xml:space="preserve"> Company Valuation Analysis — </w:t>
-      </w:r>
-      <w:r>
-        <w:rPr>
-          <w:rFonts w:ascii="Arial" w:hAnsi="Arial" w:cs="Arial"/>
-          <w:b/>
-          <w:bCs/>
-          <w:sz w:val="22"/>
-          <w:szCs w:val="22"/>
-        </w:rPr>
-        <w:t>Nestle</w:t>
+        </w:rPr>
+        <w:t xml:space="preserve">Comparable Company Valuation Analysis — </w:t>
+      </w:r>
+      <w:r>
+        <w:rPr>
+          <w:rStyle w:val="Strong"/>
+          <w:rFonts w:ascii="Aptos" w:hAnsi="Aptos"/>
+        </w:rPr>
+        <w:t>Nestlé India</w:t>
       </w:r>
     </w:p>
     <w:p>
       <w:pPr>
         <w:spacing w:before="120" w:after="60" w:line="252" w:lineRule="auto"/>
-        <w:ind w:left="142"/>
-        <w:rPr>
-          <w:rFonts w:ascii="Arial" w:hAnsi="Arial" w:cs="Arial"/>
-          <w:sz w:val="22"/>
-          <w:szCs w:val="22"/>
-        </w:rPr>
-      </w:pPr>
-      <w:r>
-        <w:rPr>
-          <w:rFonts w:ascii="Arial" w:hAnsi="Arial" w:cs="Arial"/>
-          <w:sz w:val="22"/>
-          <w:szCs w:val="22"/>
-        </w:rPr>
-        <w:t xml:space="preserve">Portfolio: </w:t>
-      </w:r>
-      <w:r>
-        <w:t>github.com/talibbb13/Finance-Portfolio/tree/main/Projects/Nestle Comp Valuation</w:t>
-      </w:r>
+        <w:rPr>
+          <w:rFonts w:ascii="Aptos" w:hAnsi="Aptos" w:cs="Arial"/>
+          <w:sz w:val="22"/>
+          <w:szCs w:val="22"/>
+        </w:rPr>
+      </w:pPr>
+      <w:r>
+        <w:rPr>
+          <w:rFonts w:ascii="Aptos" w:hAnsi="Aptos" w:cs="Arial"/>
+          <w:sz w:val="22"/>
+          <w:szCs w:val="22"/>
+        </w:rPr>
+        <w:t>Portfolio:</w:t>
+      </w:r>
+      <w:r>
+        <w:rPr>
+          <w:rFonts w:ascii="Aptos" w:hAnsi="Aptos" w:cs="Arial"/>
+          <w:sz w:val="22"/>
+          <w:szCs w:val="22"/>
+        </w:rPr>
+        <w:t xml:space="preserve"> </w:t>
+      </w:r>
+      <w:hyperlink r:id="rId8" w:history="1">
+        <w:r>
+          <w:rPr>
+            <w:rStyle w:val="Hyperlink"/>
+            <w:color w:val="auto"/>
+            <w:sz w:val="22"/>
+            <w:szCs w:val="22"/>
+            <w:u w:val="none"/>
+          </w:rPr>
+          <w:t>github.com/talibbb13/Finance-Portfolio</w:t>
+        </w:r>
+      </w:hyperlink>
     </w:p>
     <w:p>
       <w:pPr>
@@ -1314,39 +1226,21 @@
         <w:spacing w:after="60" w:line="252" w:lineRule="auto"/>
         <w:ind w:left="530"/>
         <w:rPr>
-          <w:rFonts w:ascii="Arial" w:hAnsi="Arial" w:cs="Arial"/>
-          <w:sz w:val="22"/>
-          <w:szCs w:val="22"/>
-        </w:rPr>
-      </w:pPr>
-      <w:r>
-        <w:rPr>
-          <w:rFonts w:ascii="Arial" w:hAnsi="Arial" w:cs="Arial"/>
-          <w:sz w:val="22"/>
-          <w:szCs w:val="22"/>
-        </w:rPr>
-        <w:t xml:space="preserve">Peers: </w:t>
-      </w:r>
-      <w:r>
-        <w:t>HUL</w:t>
-      </w:r>
-      <w:r>
-        <w:t xml:space="preserve">, </w:t>
-      </w:r>
-      <w:r>
-        <w:t>ITC</w:t>
-      </w:r>
-      <w:r>
-        <w:t xml:space="preserve">, </w:t>
-      </w:r>
-      <w:r>
-        <w:t>Dabur</w:t>
-      </w:r>
-      <w:r>
-        <w:t xml:space="preserve">, </w:t>
-      </w:r>
-      <w:r>
-        <w:t>Tata Consumer</w:t>
+          <w:rStyle w:val="Strong"/>
+          <w:rFonts w:ascii="Aptos" w:hAnsi="Aptos" w:cs="Arial"/>
+          <w:b w:val="0"/>
+          <w:bCs w:val="0"/>
+          <w:sz w:val="22"/>
+          <w:szCs w:val="22"/>
+        </w:rPr>
+      </w:pPr>
+      <w:r>
+        <w:rPr>
+          <w:rFonts w:ascii="Aptos" w:hAnsi="Aptos"/>
+          <w:sz w:val="22"/>
+          <w:szCs w:val="22"/>
+        </w:rPr>
+        <w:t>Selected HUL, ITC, Dabur and Tata Consumer as comparable FMCG peer companies</w:t>
       </w:r>
     </w:p>
     <w:p>
@@ -1359,18 +1253,18 @@
         <w:spacing w:after="60" w:line="252" w:lineRule="auto"/>
         <w:ind w:left="530"/>
         <w:rPr>
-          <w:rFonts w:ascii="Arial" w:hAnsi="Arial" w:cs="Arial"/>
-          <w:sz w:val="22"/>
-          <w:szCs w:val="22"/>
-        </w:rPr>
-      </w:pPr>
-      <w:r>
-        <w:rPr>
-          <w:rFonts w:ascii="Arial" w:hAnsi="Arial" w:cs="Arial"/>
-          <w:sz w:val="22"/>
-          <w:szCs w:val="22"/>
-        </w:rPr>
-        <w:t>Built peer comps table using EV/EBITDA, EV/Revenue and P/E multiples.</w:t>
+          <w:rFonts w:ascii="Aptos" w:hAnsi="Aptos" w:cs="Arial"/>
+          <w:sz w:val="22"/>
+          <w:szCs w:val="22"/>
+        </w:rPr>
+      </w:pPr>
+      <w:r>
+        <w:rPr>
+          <w:rFonts w:ascii="Aptos" w:hAnsi="Aptos"/>
+          <w:sz w:val="22"/>
+          <w:szCs w:val="22"/>
+        </w:rPr>
+        <w:t>Built trading comparable valuation using EV/EBITDA, EV/Revenue and P/E.</w:t>
       </w:r>
     </w:p>
     <w:p>
@@ -1383,25 +1277,41 @@
         <w:spacing w:after="60" w:line="252" w:lineRule="auto"/>
         <w:ind w:left="530"/>
         <w:rPr>
-          <w:rFonts w:ascii="Arial" w:hAnsi="Arial" w:cs="Arial"/>
-          <w:sz w:val="22"/>
-          <w:szCs w:val="22"/>
-        </w:rPr>
-      </w:pPr>
-      <w:r>
-        <w:rPr>
-          <w:rFonts w:ascii="Arial" w:hAnsi="Arial" w:cs="Arial"/>
-          <w:sz w:val="22"/>
-          <w:szCs w:val="22"/>
-        </w:rPr>
-        <w:t>Analyzed operating metrics (growth, margins, ROIC) to derive valuation range.</w:t>
+          <w:rFonts w:ascii="Aptos" w:hAnsi="Aptos" w:cs="Arial"/>
+          <w:sz w:val="22"/>
+          <w:szCs w:val="22"/>
+        </w:rPr>
+      </w:pPr>
+      <w:r>
+        <w:rPr>
+          <w:rFonts w:ascii="Aptos" w:hAnsi="Aptos"/>
+          <w:sz w:val="22"/>
+          <w:szCs w:val="22"/>
+        </w:rPr>
+        <w:t>Evaluated peer operating metrics including revenue growth</w:t>
+      </w:r>
+      <w:r>
+        <w:rPr>
+          <w:rFonts w:ascii="Aptos" w:hAnsi="Aptos"/>
+          <w:sz w:val="22"/>
+          <w:szCs w:val="22"/>
+        </w:rPr>
+        <w:t xml:space="preserve"> and</w:t>
+      </w:r>
+      <w:r>
+        <w:rPr>
+          <w:rFonts w:ascii="Aptos" w:hAnsi="Aptos"/>
+          <w:sz w:val="22"/>
+          <w:szCs w:val="22"/>
+        </w:rPr>
+        <w:t xml:space="preserve"> EBITDA margin</w:t>
       </w:r>
     </w:p>
     <w:p>
       <w:pPr>
         <w:spacing w:after="60" w:line="252" w:lineRule="auto"/>
         <w:rPr>
-          <w:rFonts w:ascii="Arial" w:hAnsi="Arial" w:cs="Arial"/>
+          <w:rFonts w:ascii="Aptos" w:hAnsi="Aptos" w:cs="Arial"/>
           <w:sz w:val="22"/>
           <w:szCs w:val="22"/>
         </w:rPr>
@@ -1411,17 +1321,21 @@
       <w:pPr>
         <w:spacing w:after="60" w:line="252" w:lineRule="auto"/>
         <w:rPr>
-          <w:rFonts w:ascii="Garamond" w:hAnsi="Garamond" w:cs="Arial"/>
+          <w:rFonts w:ascii="Aptos" w:hAnsi="Aptos" w:cs="Arial"/>
           <w:b/>
           <w:bCs/>
+          <w:sz w:val="26"/>
+          <w:szCs w:val="26"/>
           <w:lang w:val="en-IN"/>
         </w:rPr>
       </w:pPr>
       <w:r>
         <w:rPr>
-          <w:rFonts w:ascii="Garamond" w:hAnsi="Garamond" w:cs="Arial"/>
+          <w:rFonts w:ascii="Aptos" w:hAnsi="Aptos" w:cs="Arial"/>
           <w:b/>
           <w:bCs/>
+          <w:sz w:val="26"/>
+          <w:szCs w:val="26"/>
           <w:lang w:val="en-IN"/>
         </w:rPr>
         <w:t>ADDITIONAL INFORMATION</w:t>
@@ -1430,81 +1344,64 @@
     <w:p>
       <w:pPr>
         <w:spacing w:before="120" w:after="60" w:line="252" w:lineRule="auto"/>
-        <w:ind w:left="142"/>
-        <w:rPr>
-          <w:rFonts w:ascii="Arial" w:hAnsi="Arial" w:cs="Arial"/>
-          <w:sz w:val="22"/>
-          <w:szCs w:val="22"/>
-        </w:rPr>
-      </w:pPr>
-      <w:r>
-        <w:rPr>
-          <w:rFonts w:ascii="Arial" w:hAnsi="Arial" w:cs="Arial"/>
-          <w:sz w:val="22"/>
-          <w:szCs w:val="22"/>
-        </w:rPr>
-        <w:t xml:space="preserve">Interests: Financial </w:t>
-      </w:r>
-      <w:r>
-        <w:rPr>
-          <w:rFonts w:ascii="Arial" w:hAnsi="Arial" w:cs="Arial"/>
-          <w:sz w:val="22"/>
-          <w:szCs w:val="22"/>
-        </w:rPr>
-        <w:t>M</w:t>
-      </w:r>
-      <w:r>
-        <w:rPr>
-          <w:rFonts w:ascii="Arial" w:hAnsi="Arial" w:cs="Arial"/>
-          <w:sz w:val="22"/>
-          <w:szCs w:val="22"/>
-        </w:rPr>
-        <w:t xml:space="preserve">arkets, </w:t>
-      </w:r>
-      <w:r>
-        <w:rPr>
-          <w:rFonts w:ascii="Arial" w:hAnsi="Arial" w:cs="Arial"/>
-          <w:sz w:val="22"/>
-          <w:szCs w:val="22"/>
-        </w:rPr>
-        <w:t>C</w:t>
-      </w:r>
-      <w:r>
-        <w:rPr>
-          <w:rFonts w:ascii="Arial" w:hAnsi="Arial" w:cs="Arial"/>
-          <w:sz w:val="22"/>
-          <w:szCs w:val="22"/>
-        </w:rPr>
-        <w:t xml:space="preserve">hess, </w:t>
-      </w:r>
-      <w:r>
-        <w:rPr>
-          <w:rFonts w:ascii="Arial" w:hAnsi="Arial" w:cs="Arial"/>
-          <w:sz w:val="22"/>
-          <w:szCs w:val="22"/>
-        </w:rPr>
-        <w:t>R</w:t>
-      </w:r>
-      <w:r>
-        <w:rPr>
-          <w:rFonts w:ascii="Arial" w:hAnsi="Arial" w:cs="Arial"/>
-          <w:sz w:val="22"/>
-          <w:szCs w:val="22"/>
-        </w:rPr>
-        <w:t xml:space="preserve">eading </w:t>
-      </w:r>
-      <w:r>
-        <w:rPr>
-          <w:rFonts w:ascii="Arial" w:hAnsi="Arial" w:cs="Arial"/>
-          <w:sz w:val="22"/>
-          <w:szCs w:val="22"/>
-        </w:rPr>
-        <w:t>Books</w:t>
+        <w:rPr>
+          <w:rFonts w:ascii="Aptos" w:hAnsi="Aptos"/>
+          <w:sz w:val="22"/>
+          <w:szCs w:val="22"/>
+        </w:rPr>
+      </w:pPr>
+      <w:r>
+        <w:rPr>
+          <w:rFonts w:ascii="Aptos" w:hAnsi="Aptos" w:cs="Arial"/>
+          <w:sz w:val="22"/>
+          <w:szCs w:val="22"/>
+        </w:rPr>
+        <w:t xml:space="preserve">Interests: </w:t>
+      </w:r>
+      <w:r>
+        <w:rPr>
+          <w:rFonts w:ascii="Aptos" w:hAnsi="Aptos"/>
+          <w:sz w:val="22"/>
+          <w:szCs w:val="22"/>
+        </w:rPr>
+        <w:t xml:space="preserve">Financial </w:t>
+      </w:r>
+      <w:r>
+        <w:rPr>
+          <w:rFonts w:ascii="Aptos" w:hAnsi="Aptos"/>
+          <w:sz w:val="22"/>
+          <w:szCs w:val="22"/>
+        </w:rPr>
+        <w:t>Modelling</w:t>
+      </w:r>
+      <w:r>
+        <w:rPr>
+          <w:rFonts w:ascii="Aptos" w:hAnsi="Aptos"/>
+          <w:sz w:val="22"/>
+          <w:szCs w:val="22"/>
+        </w:rPr>
+        <w:t xml:space="preserve">, </w:t>
+      </w:r>
+      <w:r>
+        <w:rPr>
+          <w:rFonts w:ascii="Aptos" w:hAnsi="Aptos"/>
+          <w:sz w:val="22"/>
+          <w:szCs w:val="22"/>
+        </w:rPr>
+        <w:t>Reading</w:t>
+      </w:r>
+      <w:r>
+        <w:rPr>
+          <w:rFonts w:ascii="Aptos" w:hAnsi="Aptos"/>
+          <w:sz w:val="22"/>
+          <w:szCs w:val="22"/>
+        </w:rPr>
+        <w:t>, Chess</w:t>
       </w:r>
     </w:p>
     <w:sectPr>
       <w:pgSz w:w="11906" w:h="16838" w:code="9"/>
-      <w:pgMar w:top="1134" w:right="851" w:bottom="1134" w:left="851" w:header="709" w:footer="709" w:gutter="0"/>
+      <w:pgMar w:top="720" w:right="720" w:bottom="720" w:left="720" w:header="709" w:footer="709" w:gutter="0"/>
       <w:cols w:space="708"/>
       <w:docGrid w:linePitch="360"/>
     </w:sectPr>
@@ -2824,6 +2721,71 @@
       <w:bCs/>
     </w:rPr>
   </w:style>
+  <w:style w:type="paragraph" w:styleId="HTMLPreformatted">
+    <w:name w:val="HTML Preformatted"/>
+    <w:basedOn w:val="Normal"/>
+    <w:link w:val="HTMLPreformattedChar"/>
+    <w:uiPriority w:val="99"/>
+    <w:semiHidden/>
+    <w:unhideWhenUsed/>
+    <w:rsid w:val="00D14104"/>
+    <w:pPr>
+      <w:tabs>
+        <w:tab w:val="left" w:pos="916"/>
+        <w:tab w:val="left" w:pos="1832"/>
+        <w:tab w:val="left" w:pos="2748"/>
+        <w:tab w:val="left" w:pos="3664"/>
+        <w:tab w:val="left" w:pos="4580"/>
+        <w:tab w:val="left" w:pos="5496"/>
+        <w:tab w:val="left" w:pos="6412"/>
+        <w:tab w:val="left" w:pos="7328"/>
+        <w:tab w:val="left" w:pos="8244"/>
+        <w:tab w:val="left" w:pos="9160"/>
+        <w:tab w:val="left" w:pos="10076"/>
+        <w:tab w:val="left" w:pos="10992"/>
+        <w:tab w:val="left" w:pos="11908"/>
+        <w:tab w:val="left" w:pos="12824"/>
+        <w:tab w:val="left" w:pos="13740"/>
+        <w:tab w:val="left" w:pos="14656"/>
+      </w:tabs>
+      <w:spacing w:after="0" w:line="240" w:lineRule="auto"/>
+    </w:pPr>
+    <w:rPr>
+      <w:rFonts w:ascii="Courier New" w:eastAsia="Times New Roman" w:hAnsi="Courier New" w:cs="Courier New"/>
+      <w:kern w:val="0"/>
+      <w:sz w:val="20"/>
+      <w:szCs w:val="20"/>
+      <w14:ligatures w14:val="none"/>
+    </w:rPr>
+  </w:style>
+  <w:style w:type="character" w:customStyle="1" w:styleId="HTMLPreformattedChar">
+    <w:name w:val="HTML Preformatted Char"/>
+    <w:basedOn w:val="DefaultParagraphFont"/>
+    <w:link w:val="HTMLPreformatted"/>
+    <w:uiPriority w:val="99"/>
+    <w:semiHidden/>
+    <w:rsid w:val="00D14104"/>
+    <w:rPr>
+      <w:rFonts w:ascii="Courier New" w:eastAsia="Times New Roman" w:hAnsi="Courier New" w:cs="Courier New"/>
+      <w:kern w:val="0"/>
+      <w:sz w:val="20"/>
+      <w:szCs w:val="20"/>
+      <w14:ligatures w14:val="none"/>
+    </w:rPr>
+  </w:style>
+  <w:style w:type="character" w:styleId="HTMLCode">
+    <w:name w:val="HTML Code"/>
+    <w:basedOn w:val="DefaultParagraphFont"/>
+    <w:uiPriority w:val="99"/>
+    <w:semiHidden/>
+    <w:unhideWhenUsed/>
+    <w:rsid w:val="00D14104"/>
+    <w:rPr>
+      <w:rFonts w:ascii="Courier New" w:eastAsia="Times New Roman" w:hAnsi="Courier New" w:cs="Courier New"/>
+      <w:sz w:val="20"/>
+      <w:szCs w:val="20"/>
+    </w:rPr>
+  </w:style>
 </w:styles>
 </file>
 

</xml_diff>